<commit_message>
Updated Dagboek en made changes to game design document
</commit_message>
<xml_diff>
--- a/Documenten/Dagboek.docx
+++ b/Documenten/Dagboek.docx
@@ -757,17 +757,153 @@
           <w:szCs w:val="36"/>
           <w:lang w:val="nl-NL"/>
         </w:rPr>
-        <w:t>1</w:t>
-      </w:r>
-      <w:r>
-        <w:rPr>
-          <w:b/>
-          <w:bCs/>
-          <w:sz w:val="36"/>
-          <w:szCs w:val="36"/>
-          <w:lang w:val="nl-NL"/>
-        </w:rPr>
-        <w:t>2</w:t>
+        <w:t>12 Maart</w:t>
+      </w:r>
+    </w:p>
+    <w:p>
+      <w:pPr>
+        <w:rPr>
+          <w:sz w:val="28"/>
+          <w:szCs w:val="28"/>
+          <w:lang w:val="nl-NL"/>
+        </w:rPr>
+      </w:pPr>
+      <w:r>
+        <w:rPr>
+          <w:sz w:val="28"/>
+          <w:szCs w:val="28"/>
+          <w:lang w:val="nl-NL"/>
+        </w:rPr>
+        <w:t>Vandaag heb ik niet enorm veel gedaan omdat ik heel snel afgeleid werd thuis.</w:t>
+      </w:r>
+      <w:r>
+        <w:rPr>
+          <w:sz w:val="28"/>
+          <w:szCs w:val="28"/>
+          <w:lang w:val="nl-NL"/>
+        </w:rPr>
+        <w:br/>
+      </w:r>
+    </w:p>
+    <w:p>
+      <w:pPr>
+        <w:rPr>
+          <w:sz w:val="28"/>
+          <w:szCs w:val="28"/>
+          <w:lang w:val="nl-NL"/>
+        </w:rPr>
+      </w:pPr>
+    </w:p>
+    <w:p>
+      <w:pPr>
+        <w:rPr>
+          <w:sz w:val="28"/>
+          <w:szCs w:val="28"/>
+          <w:lang w:val="nl-NL"/>
+        </w:rPr>
+      </w:pPr>
+    </w:p>
+    <w:p>
+      <w:pPr>
+        <w:rPr>
+          <w:sz w:val="28"/>
+          <w:szCs w:val="28"/>
+          <w:lang w:val="nl-NL"/>
+        </w:rPr>
+      </w:pPr>
+    </w:p>
+    <w:p>
+      <w:pPr>
+        <w:rPr>
+          <w:sz w:val="28"/>
+          <w:szCs w:val="28"/>
+          <w:lang w:val="nl-NL"/>
+        </w:rPr>
+      </w:pPr>
+    </w:p>
+    <w:p>
+      <w:pPr>
+        <w:rPr>
+          <w:sz w:val="28"/>
+          <w:szCs w:val="28"/>
+          <w:lang w:val="nl-NL"/>
+        </w:rPr>
+      </w:pPr>
+      <w:r>
+        <w:rPr>
+          <w:b/>
+          <w:bCs/>
+          <w:sz w:val="36"/>
+          <w:szCs w:val="36"/>
+          <w:lang w:val="nl-NL"/>
+        </w:rPr>
+        <w:lastRenderedPageBreak/>
+        <w:t>Vrijdag 13 Maart</w:t>
+      </w:r>
+    </w:p>
+    <w:p>
+      <w:pPr>
+        <w:rPr>
+          <w:sz w:val="28"/>
+          <w:szCs w:val="28"/>
+          <w:lang w:val="nl-NL"/>
+        </w:rPr>
+      </w:pPr>
+      <w:r>
+        <w:rPr>
+          <w:sz w:val="28"/>
+          <w:szCs w:val="28"/>
+          <w:lang w:val="nl-NL"/>
+        </w:rPr>
+        <w:t>Vandaag heb ik de geschiedenis minigame afgerond en 1 playtest gedaan met meneer Dukers omdat meneer koppelaar niet aanwezig was vandaag.</w:t>
+      </w:r>
+    </w:p>
+    <w:p>
+      <w:pPr>
+        <w:rPr>
+          <w:sz w:val="28"/>
+          <w:szCs w:val="28"/>
+          <w:lang w:val="nl-NL"/>
+        </w:rPr>
+      </w:pPr>
+    </w:p>
+    <w:p>
+      <w:pPr>
+        <w:rPr>
+          <w:sz w:val="28"/>
+          <w:szCs w:val="28"/>
+          <w:lang w:val="nl-NL"/>
+        </w:rPr>
+      </w:pPr>
+      <w:r>
+        <w:rPr>
+          <w:b/>
+          <w:bCs/>
+          <w:sz w:val="36"/>
+          <w:szCs w:val="36"/>
+          <w:lang w:val="nl-NL"/>
+        </w:rPr>
+        <w:t>Maandag</w:t>
+      </w:r>
+      <w:r>
+        <w:rPr>
+          <w:b/>
+          <w:bCs/>
+          <w:sz w:val="36"/>
+          <w:szCs w:val="36"/>
+          <w:lang w:val="nl-NL"/>
+        </w:rPr>
+        <w:t xml:space="preserve"> </w:t>
+      </w:r>
+      <w:r>
+        <w:rPr>
+          <w:b/>
+          <w:bCs/>
+          <w:sz w:val="36"/>
+          <w:szCs w:val="36"/>
+          <w:lang w:val="nl-NL"/>
+        </w:rPr>
+        <w:t>16</w:t>
       </w:r>
       <w:r>
         <w:rPr>
@@ -794,99 +930,17 @@
           <w:szCs w:val="28"/>
           <w:lang w:val="nl-NL"/>
         </w:rPr>
-        <w:t>Vandaag heb ik niet enorm veel gedaan omdat ik heel snel afgeleid werd thuis.</w:t>
-      </w:r>
-      <w:r>
-        <w:rPr>
-          <w:sz w:val="28"/>
-          <w:szCs w:val="28"/>
-          <w:lang w:val="nl-NL"/>
-        </w:rPr>
-        <w:br/>
-      </w:r>
-    </w:p>
-    <w:p>
-      <w:pPr>
-        <w:rPr>
-          <w:sz w:val="28"/>
-          <w:szCs w:val="28"/>
-          <w:lang w:val="nl-NL"/>
-        </w:rPr>
-      </w:pPr>
-    </w:p>
-    <w:p>
-      <w:pPr>
-        <w:rPr>
-          <w:sz w:val="28"/>
-          <w:szCs w:val="28"/>
-          <w:lang w:val="nl-NL"/>
-        </w:rPr>
-      </w:pPr>
-    </w:p>
-    <w:p>
-      <w:pPr>
-        <w:rPr>
-          <w:sz w:val="28"/>
-          <w:szCs w:val="28"/>
-          <w:lang w:val="nl-NL"/>
-        </w:rPr>
-      </w:pPr>
-    </w:p>
-    <w:p>
-      <w:pPr>
-        <w:rPr>
-          <w:sz w:val="28"/>
-          <w:szCs w:val="28"/>
-          <w:lang w:val="nl-NL"/>
-        </w:rPr>
-      </w:pPr>
-    </w:p>
-    <w:p>
-      <w:pPr>
-        <w:rPr>
-          <w:sz w:val="28"/>
-          <w:szCs w:val="28"/>
-          <w:lang w:val="nl-NL"/>
-        </w:rPr>
-      </w:pPr>
-      <w:r>
-        <w:rPr>
-          <w:b/>
-          <w:bCs/>
-          <w:sz w:val="36"/>
-          <w:szCs w:val="36"/>
-          <w:lang w:val="nl-NL"/>
-        </w:rPr>
-        <w:lastRenderedPageBreak/>
-        <w:t>Vrijdag 13</w:t>
-      </w:r>
-      <w:r>
-        <w:rPr>
-          <w:b/>
-          <w:bCs/>
-          <w:sz w:val="36"/>
-          <w:szCs w:val="36"/>
-          <w:lang w:val="nl-NL"/>
-        </w:rPr>
-        <w:t xml:space="preserve"> Maart</w:t>
-      </w:r>
-    </w:p>
-    <w:p>
-      <w:pPr>
-        <w:rPr>
-          <w:sz w:val="28"/>
-          <w:szCs w:val="28"/>
-          <w:lang w:val="nl-NL"/>
-        </w:rPr>
-      </w:pPr>
-      <w:r>
-        <w:rPr>
-          <w:sz w:val="28"/>
-          <w:szCs w:val="28"/>
-          <w:lang w:val="nl-NL"/>
-        </w:rPr>
-        <w:t>Vandaag heb ik de geschiedenis minigame afgerond en 1 playtest gedaan met meneer Dukers omdat meneer koppelaar niet aanwezig was vandaag.</w:t>
-      </w:r>
+        <w:t>Vandaag ben ik op het idee gekomen voor de biologie minigame. Daaruit kwam dat het een game beetje zoals Overcooked gaat worden waar je cellen moet mixen en matchen om de correcte cel te krijgen. Ook heb ik de playtest met meneer koppelaar gedaan. Dat was allemaal heel succesvol gelukt.</w:t>
+      </w:r>
+    </w:p>
+    <w:p>
+      <w:pPr>
+        <w:rPr>
+          <w:sz w:val="28"/>
+          <w:szCs w:val="28"/>
+          <w:lang w:val="nl-NL"/>
+        </w:rPr>
+      </w:pPr>
     </w:p>
     <w:sectPr>
       <w:pgSz w:w="12240" w:h="15840"/>

</xml_diff>

<commit_message>
beginselen Interaction en inventory UI gemaakt ook heb ik mijn dagboek geupdate voor vandaag
</commit_message>
<xml_diff>
--- a/Documenten/Dagboek.docx
+++ b/Documenten/Dagboek.docx
@@ -389,7 +389,25 @@
           <w:szCs w:val="28"/>
           <w:lang w:val="nl-NL"/>
         </w:rPr>
-        <w:t>Vandaag ben ik bezig geweest met bugfixes rond de UI omdat dat nog niet helemaal werkt. Net zoals elke andere Donderdag werk ik vandaag vanuit huis.</w:t>
+        <w:t xml:space="preserve">Vandaag ben ik bezig geweest met </w:t>
+      </w:r>
+      <w:proofErr w:type="spellStart"/>
+      <w:r>
+        <w:rPr>
+          <w:sz w:val="28"/>
+          <w:szCs w:val="28"/>
+          <w:lang w:val="nl-NL"/>
+        </w:rPr>
+        <w:t>bugfixes</w:t>
+      </w:r>
+      <w:proofErr w:type="spellEnd"/>
+      <w:r>
+        <w:rPr>
+          <w:sz w:val="28"/>
+          <w:szCs w:val="28"/>
+          <w:lang w:val="nl-NL"/>
+        </w:rPr>
+        <w:t xml:space="preserve"> rond de UI omdat dat nog niet helemaal werkt. Net zoals elke andere Donderdag werk ik vandaag vanuit huis.</w:t>
       </w:r>
     </w:p>
     <w:p>
@@ -434,7 +452,25 @@
           <w:szCs w:val="28"/>
           <w:lang w:val="nl-NL"/>
         </w:rPr>
-        <w:t>Vandaag heb ik nog meer bugfixes gedaan. Naast dat heb ik ook gezeten met meneer Hofland om te kijken hoe de week is gegaan. Daaruit kwam dat ik meer moet letten op mijn GitHub en Trello omdat ik deze week daar niet enorm op heb gelet.</w:t>
+        <w:t xml:space="preserve">Vandaag heb ik nog meer </w:t>
+      </w:r>
+      <w:proofErr w:type="spellStart"/>
+      <w:r>
+        <w:rPr>
+          <w:sz w:val="28"/>
+          <w:szCs w:val="28"/>
+          <w:lang w:val="nl-NL"/>
+        </w:rPr>
+        <w:t>bugfixes</w:t>
+      </w:r>
+      <w:proofErr w:type="spellEnd"/>
+      <w:r>
+        <w:rPr>
+          <w:sz w:val="28"/>
+          <w:szCs w:val="28"/>
+          <w:lang w:val="nl-NL"/>
+        </w:rPr>
+        <w:t xml:space="preserve"> gedaan. Naast dat heb ik ook gezeten met meneer Hofland om te kijken hoe de week is gegaan. Daaruit kwam dat ik meer moet letten op mijn GitHub en Trello omdat ik deze week daar niet enorm op heb gelet.</w:t>
       </w:r>
     </w:p>
     <w:p>
@@ -922,6 +958,89 @@
           <w:lang w:val="nl-NL"/>
         </w:rPr>
         <w:t>Vandaag heb een lesje klaargezet voor de toekomstige Unreal lessen die ik aan student ga geven. Ook heb ik daarvoor een vragenlijst gemaakt voor na de les zodat de studenten hun kennis kunnen testen</w:t>
+      </w:r>
+    </w:p>
+    <w:p>
+      <w:pPr>
+        <w:rPr>
+          <w:sz w:val="28"/>
+          <w:szCs w:val="28"/>
+          <w:lang w:val="nl-NL"/>
+        </w:rPr>
+      </w:pPr>
+    </w:p>
+    <w:p>
+      <w:pPr>
+        <w:rPr>
+          <w:sz w:val="28"/>
+          <w:szCs w:val="28"/>
+          <w:lang w:val="nl-NL"/>
+        </w:rPr>
+      </w:pPr>
+      <w:r>
+        <w:rPr>
+          <w:b/>
+          <w:bCs/>
+          <w:sz w:val="36"/>
+          <w:szCs w:val="36"/>
+          <w:lang w:val="nl-NL"/>
+        </w:rPr>
+        <w:t xml:space="preserve">Woensdag </w:t>
+      </w:r>
+      <w:r>
+        <w:rPr>
+          <w:b/>
+          <w:bCs/>
+          <w:sz w:val="36"/>
+          <w:szCs w:val="36"/>
+          <w:lang w:val="nl-NL"/>
+        </w:rPr>
+        <w:t>1</w:t>
+      </w:r>
+      <w:r>
+        <w:rPr>
+          <w:b/>
+          <w:bCs/>
+          <w:sz w:val="36"/>
+          <w:szCs w:val="36"/>
+          <w:lang w:val="nl-NL"/>
+        </w:rPr>
+        <w:t>8</w:t>
+      </w:r>
+      <w:r>
+        <w:rPr>
+          <w:b/>
+          <w:bCs/>
+          <w:sz w:val="36"/>
+          <w:szCs w:val="36"/>
+          <w:lang w:val="nl-NL"/>
+        </w:rPr>
+        <w:t xml:space="preserve"> Maart</w:t>
+      </w:r>
+    </w:p>
+    <w:p>
+      <w:pPr>
+        <w:rPr>
+          <w:sz w:val="28"/>
+          <w:szCs w:val="28"/>
+          <w:lang w:val="nl-NL"/>
+        </w:rPr>
+      </w:pPr>
+      <w:r>
+        <w:rPr>
+          <w:sz w:val="28"/>
+          <w:szCs w:val="28"/>
+          <w:lang w:val="nl-NL"/>
+        </w:rPr>
+        <w:t>Vandaag heb ik de beginselen van de biologie minigame klaargezet waaronder: De basis voor interactie met de Items/Cellen en de Inventory UI die daaruit komt. Ook heb ik kunnen observeren hoe meneer Hofland de eerste les doet en daar feedback vanuit gekregen die ik volgende week dinsdag ga integreren</w:t>
+      </w:r>
+      <w:r>
+        <w:rPr>
+          <w:sz w:val="28"/>
+          <w:szCs w:val="28"/>
+          <w:lang w:val="nl-NL"/>
+        </w:rPr>
+        <w:t>.</w:t>
       </w:r>
     </w:p>
     <w:p>

</xml_diff>

<commit_message>
Made progress to the pickup/inventory system also made start to crafting bench updated diary aswell
</commit_message>
<xml_diff>
--- a/Documenten/Dagboek.docx
+++ b/Documenten/Dagboek.docx
@@ -389,25 +389,7 @@
           <w:szCs w:val="28"/>
           <w:lang w:val="nl-NL"/>
         </w:rPr>
-        <w:t xml:space="preserve">Vandaag ben ik bezig geweest met </w:t>
-      </w:r>
-      <w:proofErr w:type="spellStart"/>
-      <w:r>
-        <w:rPr>
-          <w:sz w:val="28"/>
-          <w:szCs w:val="28"/>
-          <w:lang w:val="nl-NL"/>
-        </w:rPr>
-        <w:t>bugfixes</w:t>
-      </w:r>
-      <w:proofErr w:type="spellEnd"/>
-      <w:r>
-        <w:rPr>
-          <w:sz w:val="28"/>
-          <w:szCs w:val="28"/>
-          <w:lang w:val="nl-NL"/>
-        </w:rPr>
-        <w:t xml:space="preserve"> rond de UI omdat dat nog niet helemaal werkt. Net zoals elke andere Donderdag werk ik vandaag vanuit huis.</w:t>
+        <w:t>Vandaag ben ik bezig geweest met bugfixes rond de UI omdat dat nog niet helemaal werkt. Net zoals elke andere Donderdag werk ik vandaag vanuit huis.</w:t>
       </w:r>
     </w:p>
     <w:p>
@@ -452,25 +434,7 @@
           <w:szCs w:val="28"/>
           <w:lang w:val="nl-NL"/>
         </w:rPr>
-        <w:t xml:space="preserve">Vandaag heb ik nog meer </w:t>
-      </w:r>
-      <w:proofErr w:type="spellStart"/>
-      <w:r>
-        <w:rPr>
-          <w:sz w:val="28"/>
-          <w:szCs w:val="28"/>
-          <w:lang w:val="nl-NL"/>
-        </w:rPr>
-        <w:t>bugfixes</w:t>
-      </w:r>
-      <w:proofErr w:type="spellEnd"/>
-      <w:r>
-        <w:rPr>
-          <w:sz w:val="28"/>
-          <w:szCs w:val="28"/>
-          <w:lang w:val="nl-NL"/>
-        </w:rPr>
-        <w:t xml:space="preserve"> gedaan. Naast dat heb ik ook gezeten met meneer Hofland om te kijken hoe de week is gegaan. Daaruit kwam dat ik meer moet letten op mijn GitHub en Trello omdat ik deze week daar niet enorm op heb gelet.</w:t>
+        <w:t>Vandaag heb ik nog meer bugfixes gedaan. Naast dat heb ik ook gezeten met meneer Hofland om te kijken hoe de week is gegaan. Daaruit kwam dat ik meer moet letten op mijn GitHub en Trello omdat ik deze week daar niet enorm op heb gelet.</w:t>
       </w:r>
     </w:p>
     <w:p>
@@ -910,27 +874,125 @@
           <w:szCs w:val="36"/>
           <w:lang w:val="nl-NL"/>
         </w:rPr>
-        <w:t>Dins</w:t>
-      </w:r>
-      <w:r>
-        <w:rPr>
-          <w:b/>
-          <w:bCs/>
-          <w:sz w:val="36"/>
-          <w:szCs w:val="36"/>
-          <w:lang w:val="nl-NL"/>
-        </w:rPr>
-        <w:t>dag 1</w:t>
-      </w:r>
-      <w:r>
-        <w:rPr>
-          <w:b/>
-          <w:bCs/>
-          <w:sz w:val="36"/>
-          <w:szCs w:val="36"/>
-          <w:lang w:val="nl-NL"/>
-        </w:rPr>
-        <w:t>7</w:t>
+        <w:t>Dinsdag 17 Maart</w:t>
+      </w:r>
+    </w:p>
+    <w:p>
+      <w:pPr>
+        <w:rPr>
+          <w:sz w:val="28"/>
+          <w:szCs w:val="28"/>
+          <w:lang w:val="nl-NL"/>
+        </w:rPr>
+      </w:pPr>
+      <w:r>
+        <w:rPr>
+          <w:sz w:val="28"/>
+          <w:szCs w:val="28"/>
+          <w:lang w:val="nl-NL"/>
+        </w:rPr>
+        <w:t>Vandaag heb een lesje klaargezet voor de toekomstige Unreal lessen die ik aan student ga geven. Ook heb ik daarvoor een vragenlijst gemaakt voor na de les zodat de studenten hun kennis kunnen testen</w:t>
+      </w:r>
+    </w:p>
+    <w:p>
+      <w:pPr>
+        <w:rPr>
+          <w:sz w:val="28"/>
+          <w:szCs w:val="28"/>
+          <w:lang w:val="nl-NL"/>
+        </w:rPr>
+      </w:pPr>
+    </w:p>
+    <w:p>
+      <w:pPr>
+        <w:rPr>
+          <w:sz w:val="28"/>
+          <w:szCs w:val="28"/>
+          <w:lang w:val="nl-NL"/>
+        </w:rPr>
+      </w:pPr>
+      <w:r>
+        <w:rPr>
+          <w:b/>
+          <w:bCs/>
+          <w:sz w:val="36"/>
+          <w:szCs w:val="36"/>
+          <w:lang w:val="nl-NL"/>
+        </w:rPr>
+        <w:t>Woensdag 18 Maart</w:t>
+      </w:r>
+    </w:p>
+    <w:p>
+      <w:pPr>
+        <w:rPr>
+          <w:sz w:val="28"/>
+          <w:szCs w:val="28"/>
+          <w:lang w:val="nl-NL"/>
+        </w:rPr>
+      </w:pPr>
+      <w:r>
+        <w:rPr>
+          <w:sz w:val="28"/>
+          <w:szCs w:val="28"/>
+          <w:lang w:val="nl-NL"/>
+        </w:rPr>
+        <w:t>Vandaag heb ik de beginselen van de biologie minigame klaargezet waaronder: De basis voor interactie met de Items/Cellen en de Inventory UI die daaruit komt. Ook heb ik kunnen observeren hoe meneer Hofland de eerste les doet en daar feedback vanuit gekregen die ik volgende week dinsdag ga integreren</w:t>
+      </w:r>
+      <w:r>
+        <w:rPr>
+          <w:sz w:val="28"/>
+          <w:szCs w:val="28"/>
+          <w:lang w:val="nl-NL"/>
+        </w:rPr>
+        <w:t>.</w:t>
+      </w:r>
+    </w:p>
+    <w:p>
+      <w:pPr>
+        <w:rPr>
+          <w:sz w:val="28"/>
+          <w:szCs w:val="28"/>
+          <w:lang w:val="nl-NL"/>
+        </w:rPr>
+      </w:pPr>
+    </w:p>
+    <w:p>
+      <w:pPr>
+        <w:rPr>
+          <w:sz w:val="28"/>
+          <w:szCs w:val="28"/>
+          <w:lang w:val="nl-NL"/>
+        </w:rPr>
+      </w:pPr>
+      <w:r>
+        <w:rPr>
+          <w:b/>
+          <w:bCs/>
+          <w:sz w:val="36"/>
+          <w:szCs w:val="36"/>
+          <w:lang w:val="nl-NL"/>
+        </w:rPr>
+        <w:t>Donderdag</w:t>
+      </w:r>
+      <w:r>
+        <w:rPr>
+          <w:b/>
+          <w:bCs/>
+          <w:sz w:val="36"/>
+          <w:szCs w:val="36"/>
+          <w:lang w:val="nl-NL"/>
+        </w:rPr>
+        <w:t xml:space="preserve"> 1</w:t>
+      </w:r>
+      <w:r>
+        <w:rPr>
+          <w:b/>
+          <w:bCs/>
+          <w:sz w:val="36"/>
+          <w:szCs w:val="36"/>
+          <w:lang w:val="nl-NL"/>
+        </w:rPr>
+        <w:t>9</w:t>
       </w:r>
       <w:r>
         <w:rPr>
@@ -957,55 +1019,47 @@
           <w:szCs w:val="28"/>
           <w:lang w:val="nl-NL"/>
         </w:rPr>
-        <w:t>Vandaag heb een lesje klaargezet voor de toekomstige Unreal lessen die ik aan student ga geven. Ook heb ik daarvoor een vragenlijst gemaakt voor na de les zodat de studenten hun kennis kunnen testen</w:t>
-      </w:r>
-    </w:p>
-    <w:p>
-      <w:pPr>
-        <w:rPr>
-          <w:sz w:val="28"/>
-          <w:szCs w:val="28"/>
-          <w:lang w:val="nl-NL"/>
-        </w:rPr>
-      </w:pPr>
-    </w:p>
-    <w:p>
-      <w:pPr>
-        <w:rPr>
-          <w:sz w:val="28"/>
-          <w:szCs w:val="28"/>
-          <w:lang w:val="nl-NL"/>
-        </w:rPr>
-      </w:pPr>
-      <w:r>
-        <w:rPr>
-          <w:b/>
-          <w:bCs/>
-          <w:sz w:val="36"/>
-          <w:szCs w:val="36"/>
-          <w:lang w:val="nl-NL"/>
-        </w:rPr>
-        <w:t xml:space="preserve">Woensdag </w:t>
-      </w:r>
-      <w:r>
-        <w:rPr>
-          <w:b/>
-          <w:bCs/>
-          <w:sz w:val="36"/>
-          <w:szCs w:val="36"/>
-          <w:lang w:val="nl-NL"/>
-        </w:rPr>
-        <w:t>1</w:t>
-      </w:r>
-      <w:r>
-        <w:rPr>
-          <w:b/>
-          <w:bCs/>
-          <w:sz w:val="36"/>
-          <w:szCs w:val="36"/>
-          <w:lang w:val="nl-NL"/>
-        </w:rPr>
-        <w:t>8</w:t>
+        <w:t>Vandaag heb ik aan mijn portfolio gewerkt omdat de tweede sollicitatieperiode eraan komt en ik wil mijn portfolio graag klaar hebben zodat ik zo snel mogelijk weer kan solliciteren bij mijn volgende stagebedrijf.</w:t>
+      </w:r>
+    </w:p>
+    <w:p>
+      <w:pPr>
+        <w:rPr>
+          <w:sz w:val="28"/>
+          <w:szCs w:val="28"/>
+          <w:lang w:val="nl-NL"/>
+        </w:rPr>
+      </w:pPr>
+      <w:r>
+        <w:rPr>
+          <w:b/>
+          <w:bCs/>
+          <w:sz w:val="36"/>
+          <w:szCs w:val="36"/>
+          <w:lang w:val="nl-NL"/>
+        </w:rPr>
+        <w:lastRenderedPageBreak/>
+        <w:t>Vrijdag</w:t>
+      </w:r>
+      <w:r>
+        <w:rPr>
+          <w:b/>
+          <w:bCs/>
+          <w:sz w:val="36"/>
+          <w:szCs w:val="36"/>
+          <w:lang w:val="nl-NL"/>
+        </w:rPr>
+        <w:t xml:space="preserve"> </w:t>
+      </w:r>
+      <w:r>
+        <w:rPr>
+          <w:b/>
+          <w:bCs/>
+          <w:sz w:val="36"/>
+          <w:szCs w:val="36"/>
+          <w:lang w:val="nl-NL"/>
+        </w:rPr>
+        <w:t>20</w:t>
       </w:r>
       <w:r>
         <w:rPr>
@@ -1032,25 +1086,44 @@
           <w:szCs w:val="28"/>
           <w:lang w:val="nl-NL"/>
         </w:rPr>
-        <w:t>Vandaag heb ik de beginselen van de biologie minigame klaargezet waaronder: De basis voor interactie met de Items/Cellen en de Inventory UI die daaruit komt. Ook heb ik kunnen observeren hoe meneer Hofland de eerste les doet en daar feedback vanuit gekregen die ik volgende week dinsdag ga integreren</w:t>
-      </w:r>
-      <w:r>
-        <w:rPr>
-          <w:sz w:val="28"/>
-          <w:szCs w:val="28"/>
-          <w:lang w:val="nl-NL"/>
-        </w:rPr>
-        <w:t>.</w:t>
-      </w:r>
-    </w:p>
-    <w:p>
-      <w:pPr>
-        <w:rPr>
-          <w:sz w:val="28"/>
-          <w:szCs w:val="28"/>
-          <w:lang w:val="nl-NL"/>
-        </w:rPr>
-      </w:pPr>
+        <w:t xml:space="preserve">Vandaag heb ik veel progressie gemaakt naar het prototype van de biologie minigame waaronder het hele gedoe van dingen oppakken en in je </w:t>
+      </w:r>
+      <w:proofErr w:type="spellStart"/>
+      <w:r>
+        <w:rPr>
+          <w:sz w:val="28"/>
+          <w:szCs w:val="28"/>
+          <w:lang w:val="nl-NL"/>
+        </w:rPr>
+        <w:t>inventory</w:t>
+      </w:r>
+      <w:proofErr w:type="spellEnd"/>
+      <w:r>
+        <w:rPr>
+          <w:sz w:val="28"/>
+          <w:szCs w:val="28"/>
+          <w:lang w:val="nl-NL"/>
+        </w:rPr>
+        <w:t xml:space="preserve"> stoppen ook heb ik een start gemaakt aan het gedoe van spullen op het </w:t>
+      </w:r>
+      <w:proofErr w:type="spellStart"/>
+      <w:r>
+        <w:rPr>
+          <w:sz w:val="28"/>
+          <w:szCs w:val="28"/>
+          <w:lang w:val="nl-NL"/>
+        </w:rPr>
+        <w:t>crafting</w:t>
+      </w:r>
+      <w:proofErr w:type="spellEnd"/>
+      <w:r>
+        <w:rPr>
+          <w:sz w:val="28"/>
+          <w:szCs w:val="28"/>
+          <w:lang w:val="nl-NL"/>
+        </w:rPr>
+        <w:t xml:space="preserve"> bureau gemaakt dus dat.</w:t>
+      </w:r>
     </w:p>
     <w:sectPr>
       <w:pgSz w:w="12240" w:h="15840"/>

</xml_diff>

<commit_message>
added crafting system and inventory logic table works fully now
</commit_message>
<xml_diff>
--- a/Documenten/Dagboek.docx
+++ b/Documenten/Dagboek.docx
@@ -972,27 +972,107 @@
           <w:szCs w:val="36"/>
           <w:lang w:val="nl-NL"/>
         </w:rPr>
-        <w:t>Donderdag</w:t>
-      </w:r>
-      <w:r>
-        <w:rPr>
-          <w:b/>
-          <w:bCs/>
-          <w:sz w:val="36"/>
-          <w:szCs w:val="36"/>
-          <w:lang w:val="nl-NL"/>
-        </w:rPr>
-        <w:t xml:space="preserve"> 1</w:t>
-      </w:r>
-      <w:r>
-        <w:rPr>
-          <w:b/>
-          <w:bCs/>
-          <w:sz w:val="36"/>
-          <w:szCs w:val="36"/>
-          <w:lang w:val="nl-NL"/>
-        </w:rPr>
-        <w:t>9</w:t>
+        <w:t>Donderdag 19 Maart</w:t>
+      </w:r>
+    </w:p>
+    <w:p>
+      <w:pPr>
+        <w:rPr>
+          <w:sz w:val="28"/>
+          <w:szCs w:val="28"/>
+          <w:lang w:val="nl-NL"/>
+        </w:rPr>
+      </w:pPr>
+      <w:r>
+        <w:rPr>
+          <w:sz w:val="28"/>
+          <w:szCs w:val="28"/>
+          <w:lang w:val="nl-NL"/>
+        </w:rPr>
+        <w:t>Vandaag heb ik aan mijn portfolio gewerkt omdat de tweede sollicitatieperiode eraan komt en ik wil mijn portfolio graag klaar hebben zodat ik zo snel mogelijk weer kan solliciteren bij mijn volgende stagebedrijf.</w:t>
+      </w:r>
+    </w:p>
+    <w:p>
+      <w:pPr>
+        <w:rPr>
+          <w:sz w:val="28"/>
+          <w:szCs w:val="28"/>
+          <w:lang w:val="nl-NL"/>
+        </w:rPr>
+      </w:pPr>
+      <w:r>
+        <w:rPr>
+          <w:b/>
+          <w:bCs/>
+          <w:sz w:val="36"/>
+          <w:szCs w:val="36"/>
+          <w:lang w:val="nl-NL"/>
+        </w:rPr>
+        <w:lastRenderedPageBreak/>
+        <w:t>Vrijdag 20 Maart</w:t>
+      </w:r>
+    </w:p>
+    <w:p>
+      <w:pPr>
+        <w:rPr>
+          <w:sz w:val="28"/>
+          <w:szCs w:val="28"/>
+          <w:lang w:val="nl-NL"/>
+        </w:rPr>
+      </w:pPr>
+      <w:r>
+        <w:rPr>
+          <w:sz w:val="28"/>
+          <w:szCs w:val="28"/>
+          <w:lang w:val="nl-NL"/>
+        </w:rPr>
+        <w:t>Vandaag heb ik veel progressie gemaakt naar het prototype van de biologie minigame waaronder het hele gedoe van dingen oppakken en in je inventory stoppen ook heb ik een start gemaakt aan het gedoe van spullen op het crafting bureau gemaakt dus dat.</w:t>
+      </w:r>
+      <w:r>
+        <w:rPr>
+          <w:sz w:val="28"/>
+          <w:szCs w:val="28"/>
+          <w:lang w:val="nl-NL"/>
+        </w:rPr>
+        <w:br/>
+      </w:r>
+      <w:r>
+        <w:rPr>
+          <w:sz w:val="28"/>
+          <w:szCs w:val="28"/>
+          <w:lang w:val="nl-NL"/>
+        </w:rPr>
+        <w:br/>
+      </w:r>
+      <w:r>
+        <w:rPr>
+          <w:b/>
+          <w:bCs/>
+          <w:sz w:val="36"/>
+          <w:szCs w:val="36"/>
+          <w:lang w:val="nl-NL"/>
+        </w:rPr>
+        <w:t>Maan</w:t>
+      </w:r>
+      <w:r>
+        <w:rPr>
+          <w:b/>
+          <w:bCs/>
+          <w:sz w:val="36"/>
+          <w:szCs w:val="36"/>
+          <w:lang w:val="nl-NL"/>
+        </w:rPr>
+        <w:t>dag 2</w:t>
+      </w:r>
+      <w:r>
+        <w:rPr>
+          <w:b/>
+          <w:bCs/>
+          <w:sz w:val="36"/>
+          <w:szCs w:val="36"/>
+          <w:lang w:val="nl-NL"/>
+        </w:rPr>
+        <w:t>3</w:t>
       </w:r>
       <w:r>
         <w:rPr>
@@ -1019,47 +1099,63 @@
           <w:szCs w:val="28"/>
           <w:lang w:val="nl-NL"/>
         </w:rPr>
-        <w:t>Vandaag heb ik aan mijn portfolio gewerkt omdat de tweede sollicitatieperiode eraan komt en ik wil mijn portfolio graag klaar hebben zodat ik zo snel mogelijk weer kan solliciteren bij mijn volgende stagebedrijf.</w:t>
-      </w:r>
-    </w:p>
-    <w:p>
-      <w:pPr>
-        <w:rPr>
-          <w:sz w:val="28"/>
-          <w:szCs w:val="28"/>
-          <w:lang w:val="nl-NL"/>
-        </w:rPr>
-      </w:pPr>
-      <w:r>
-        <w:rPr>
-          <w:b/>
-          <w:bCs/>
-          <w:sz w:val="36"/>
-          <w:szCs w:val="36"/>
-          <w:lang w:val="nl-NL"/>
-        </w:rPr>
-        <w:lastRenderedPageBreak/>
-        <w:t>Vrijdag</w:t>
-      </w:r>
-      <w:r>
-        <w:rPr>
-          <w:b/>
-          <w:bCs/>
-          <w:sz w:val="36"/>
-          <w:szCs w:val="36"/>
-          <w:lang w:val="nl-NL"/>
-        </w:rPr>
-        <w:t xml:space="preserve"> </w:t>
-      </w:r>
-      <w:r>
-        <w:rPr>
-          <w:b/>
-          <w:bCs/>
-          <w:sz w:val="36"/>
-          <w:szCs w:val="36"/>
-          <w:lang w:val="nl-NL"/>
-        </w:rPr>
-        <w:t>20</w:t>
+        <w:t>Vandaag heb ik veel progressie gemaakt richting de core mechanics van de biologie game waaronder het oppakken en neerzetten van objecten en het systeem van de crafting table</w:t>
+      </w:r>
+      <w:r>
+        <w:rPr>
+          <w:sz w:val="28"/>
+          <w:szCs w:val="28"/>
+          <w:lang w:val="nl-NL"/>
+        </w:rPr>
+        <w:t xml:space="preserve"> en het mix en matchen van de items die er op neergezet wordt.</w:t>
+      </w:r>
+    </w:p>
+    <w:p>
+      <w:pPr>
+        <w:rPr>
+          <w:sz w:val="28"/>
+          <w:szCs w:val="28"/>
+          <w:lang w:val="nl-NL"/>
+        </w:rPr>
+      </w:pPr>
+    </w:p>
+    <w:p>
+      <w:pPr>
+        <w:rPr>
+          <w:sz w:val="28"/>
+          <w:szCs w:val="28"/>
+          <w:lang w:val="nl-NL"/>
+        </w:rPr>
+      </w:pPr>
+      <w:r>
+        <w:rPr>
+          <w:b/>
+          <w:bCs/>
+          <w:sz w:val="36"/>
+          <w:szCs w:val="36"/>
+          <w:lang w:val="nl-NL"/>
+        </w:rPr>
+        <w:t>Dins</w:t>
+      </w:r>
+      <w:r>
+        <w:rPr>
+          <w:b/>
+          <w:bCs/>
+          <w:sz w:val="36"/>
+          <w:szCs w:val="36"/>
+          <w:lang w:val="nl-NL"/>
+        </w:rPr>
+        <w:t>dag 2</w:t>
+      </w:r>
+      <w:r>
+        <w:rPr>
+          <w:b/>
+          <w:bCs/>
+          <w:sz w:val="36"/>
+          <w:szCs w:val="36"/>
+          <w:lang w:val="nl-NL"/>
+        </w:rPr>
+        <w:t>4</w:t>
       </w:r>
       <w:r>
         <w:rPr>
@@ -1080,50 +1176,6 @@
           <w:lang w:val="nl-NL"/>
         </w:rPr>
       </w:pPr>
-      <w:r>
-        <w:rPr>
-          <w:sz w:val="28"/>
-          <w:szCs w:val="28"/>
-          <w:lang w:val="nl-NL"/>
-        </w:rPr>
-        <w:t xml:space="preserve">Vandaag heb ik veel progressie gemaakt naar het prototype van de biologie minigame waaronder het hele gedoe van dingen oppakken en in je </w:t>
-      </w:r>
-      <w:proofErr w:type="spellStart"/>
-      <w:r>
-        <w:rPr>
-          <w:sz w:val="28"/>
-          <w:szCs w:val="28"/>
-          <w:lang w:val="nl-NL"/>
-        </w:rPr>
-        <w:t>inventory</w:t>
-      </w:r>
-      <w:proofErr w:type="spellEnd"/>
-      <w:r>
-        <w:rPr>
-          <w:sz w:val="28"/>
-          <w:szCs w:val="28"/>
-          <w:lang w:val="nl-NL"/>
-        </w:rPr>
-        <w:t xml:space="preserve"> stoppen ook heb ik een start gemaakt aan het gedoe van spullen op het </w:t>
-      </w:r>
-      <w:proofErr w:type="spellStart"/>
-      <w:r>
-        <w:rPr>
-          <w:sz w:val="28"/>
-          <w:szCs w:val="28"/>
-          <w:lang w:val="nl-NL"/>
-        </w:rPr>
-        <w:t>crafting</w:t>
-      </w:r>
-      <w:proofErr w:type="spellEnd"/>
-      <w:r>
-        <w:rPr>
-          <w:sz w:val="28"/>
-          <w:szCs w:val="28"/>
-          <w:lang w:val="nl-NL"/>
-        </w:rPr>
-        <w:t xml:space="preserve"> bureau gemaakt dus dat.</w:t>
-      </w:r>
     </w:p>
     <w:sectPr>
       <w:pgSz w:w="12240" w:h="15840"/>

</xml_diff>

<commit_message>
did allot of bugfixing and added the target item logic also updated diary
</commit_message>
<xml_diff>
--- a/Documenten/Dagboek.docx
+++ b/Documenten/Dagboek.docx
@@ -1026,7 +1026,25 @@
           <w:szCs w:val="28"/>
           <w:lang w:val="nl-NL"/>
         </w:rPr>
-        <w:t>Vandaag heb ik veel progressie gemaakt naar het prototype van de biologie minigame waaronder het hele gedoe van dingen oppakken en in je inventory stoppen ook heb ik een start gemaakt aan het gedoe van spullen op het crafting bureau gemaakt dus dat.</w:t>
+        <w:t xml:space="preserve">Vandaag heb ik veel progressie gemaakt naar het prototype van de biologie minigame waaronder het hele gedoe van dingen oppakken en in je </w:t>
+      </w:r>
+      <w:proofErr w:type="spellStart"/>
+      <w:r>
+        <w:rPr>
+          <w:sz w:val="28"/>
+          <w:szCs w:val="28"/>
+          <w:lang w:val="nl-NL"/>
+        </w:rPr>
+        <w:t>inventory</w:t>
+      </w:r>
+      <w:proofErr w:type="spellEnd"/>
+      <w:r>
+        <w:rPr>
+          <w:sz w:val="28"/>
+          <w:szCs w:val="28"/>
+          <w:lang w:val="nl-NL"/>
+        </w:rPr>
+        <w:t xml:space="preserve"> stoppen ook heb ik een start gemaakt aan het gedoe van spullen op het crafting bureau gemaakt dus dat.</w:t>
       </w:r>
       <w:r>
         <w:rPr>
@@ -1176,6 +1194,62 @@
           <w:lang w:val="nl-NL"/>
         </w:rPr>
       </w:pPr>
+      <w:r>
+        <w:rPr>
+          <w:sz w:val="28"/>
+          <w:szCs w:val="28"/>
+          <w:lang w:val="nl-NL"/>
+        </w:rPr>
+        <w:t>Vandaag heb ik een hele lange</w:t>
+      </w:r>
+      <w:r>
+        <w:rPr>
+          <w:sz w:val="28"/>
+          <w:szCs w:val="28"/>
+          <w:lang w:val="nl-NL"/>
+        </w:rPr>
+        <w:t xml:space="preserve"> </w:t>
+      </w:r>
+      <w:r>
+        <w:rPr>
+          <w:sz w:val="28"/>
+          <w:szCs w:val="28"/>
+          <w:lang w:val="nl-NL"/>
+        </w:rPr>
+        <w:t xml:space="preserve">tijd zitten bug fixen rondom de crafting mechanic. Ook heb ik </w:t>
+      </w:r>
+      <w:r>
+        <w:rPr>
+          <w:sz w:val="28"/>
+          <w:szCs w:val="28"/>
+          <w:lang w:val="nl-NL"/>
+        </w:rPr>
+        <w:t>het script</w:t>
+      </w:r>
+      <w:r>
+        <w:rPr>
+          <w:sz w:val="28"/>
+          <w:szCs w:val="28"/>
+          <w:lang w:val="nl-NL"/>
+        </w:rPr>
+        <w:t xml:space="preserve"> gemaakt waar de target item wordt </w:t>
+      </w:r>
+      <w:r>
+        <w:rPr>
+          <w:sz w:val="28"/>
+          <w:szCs w:val="28"/>
+          <w:lang w:val="nl-NL"/>
+        </w:rPr>
+        <w:t>gedisplayd</w:t>
+      </w:r>
+      <w:r>
+        <w:rPr>
+          <w:sz w:val="28"/>
+          <w:szCs w:val="28"/>
+          <w:lang w:val="nl-NL"/>
+        </w:rPr>
+        <w:t xml:space="preserve"> en dat je daar items kan inleveren en dan checkt ie of het de goeie is, zo ja dan geeft een punt anders heb je pech.</w:t>
+      </w:r>
     </w:p>
     <w:sectPr>
       <w:pgSz w:w="12240" w:h="15840"/>

</xml_diff>

<commit_message>
updated dagboek and added comments to the scripts
</commit_message>
<xml_diff>
--- a/Documenten/Dagboek.docx
+++ b/Documenten/Dagboek.docx
@@ -1264,6 +1264,148 @@
           <w:lang w:val="nl-NL"/>
         </w:rPr>
       </w:pPr>
+    </w:p>
+    <w:p>
+      <w:pPr>
+        <w:rPr>
+          <w:sz w:val="28"/>
+          <w:szCs w:val="28"/>
+          <w:lang w:val="nl-NL"/>
+        </w:rPr>
+      </w:pPr>
+      <w:r>
+        <w:rPr>
+          <w:b/>
+          <w:bCs/>
+          <w:sz w:val="36"/>
+          <w:szCs w:val="36"/>
+          <w:lang w:val="nl-NL"/>
+        </w:rPr>
+        <w:t>Donderdag</w:t>
+      </w:r>
+      <w:r>
+        <w:rPr>
+          <w:b/>
+          <w:bCs/>
+          <w:sz w:val="36"/>
+          <w:szCs w:val="36"/>
+          <w:lang w:val="nl-NL"/>
+        </w:rPr>
+        <w:t xml:space="preserve"> 2</w:t>
+      </w:r>
+      <w:r>
+        <w:rPr>
+          <w:b/>
+          <w:bCs/>
+          <w:sz w:val="36"/>
+          <w:szCs w:val="36"/>
+          <w:lang w:val="nl-NL"/>
+        </w:rPr>
+        <w:t>6</w:t>
+      </w:r>
+      <w:r>
+        <w:rPr>
+          <w:b/>
+          <w:bCs/>
+          <w:sz w:val="36"/>
+          <w:szCs w:val="36"/>
+          <w:lang w:val="nl-NL"/>
+        </w:rPr>
+        <w:t xml:space="preserve"> Maart</w:t>
+      </w:r>
+    </w:p>
+    <w:p>
+      <w:pPr>
+        <w:rPr>
+          <w:sz w:val="28"/>
+          <w:szCs w:val="28"/>
+          <w:lang w:val="nl-NL"/>
+        </w:rPr>
+      </w:pPr>
+      <w:r>
+        <w:rPr>
+          <w:sz w:val="28"/>
+          <w:szCs w:val="28"/>
+          <w:lang w:val="nl-NL"/>
+        </w:rPr>
+        <w:t>Vandaag heb ik aan mijn portfolio gewerkt en de biologie pagine gebouwt.</w:t>
+      </w:r>
+    </w:p>
+    <w:p>
+      <w:pPr>
+        <w:rPr>
+          <w:sz w:val="28"/>
+          <w:szCs w:val="28"/>
+          <w:lang w:val="nl-NL"/>
+        </w:rPr>
+      </w:pPr>
+    </w:p>
+    <w:p>
+      <w:pPr>
+        <w:rPr>
+          <w:sz w:val="28"/>
+          <w:szCs w:val="28"/>
+          <w:lang w:val="nl-NL"/>
+        </w:rPr>
+      </w:pPr>
+      <w:r>
+        <w:rPr>
+          <w:b/>
+          <w:bCs/>
+          <w:sz w:val="36"/>
+          <w:szCs w:val="36"/>
+          <w:lang w:val="nl-NL"/>
+        </w:rPr>
+        <w:lastRenderedPageBreak/>
+        <w:t>Vrijdag</w:t>
+      </w:r>
+      <w:r>
+        <w:rPr>
+          <w:b/>
+          <w:bCs/>
+          <w:sz w:val="36"/>
+          <w:szCs w:val="36"/>
+          <w:lang w:val="nl-NL"/>
+        </w:rPr>
+        <w:t xml:space="preserve"> 2</w:t>
+      </w:r>
+      <w:r>
+        <w:rPr>
+          <w:b/>
+          <w:bCs/>
+          <w:sz w:val="36"/>
+          <w:szCs w:val="36"/>
+          <w:lang w:val="nl-NL"/>
+        </w:rPr>
+        <w:t>7</w:t>
+      </w:r>
+      <w:r>
+        <w:rPr>
+          <w:b/>
+          <w:bCs/>
+          <w:sz w:val="36"/>
+          <w:szCs w:val="36"/>
+          <w:lang w:val="nl-NL"/>
+        </w:rPr>
+        <w:t xml:space="preserve"> Maart</w:t>
+      </w:r>
+    </w:p>
+    <w:p>
+      <w:pPr>
+        <w:rPr>
+          <w:sz w:val="28"/>
+          <w:szCs w:val="28"/>
+          <w:lang w:val="nl-NL"/>
+        </w:rPr>
+      </w:pPr>
+      <w:r>
+        <w:rPr>
+          <w:sz w:val="28"/>
+          <w:szCs w:val="28"/>
+          <w:lang w:val="nl-NL"/>
+        </w:rPr>
+        <w:t>Vandaag heb ik de rest van mijn portfolio gemaakt en heb ik referentie foto’s genomen voor de map in de biologie minigame.</w:t>
+      </w:r>
     </w:p>
     <w:sectPr>
       <w:pgSz w:w="12240" w:h="15840"/>

</xml_diff>

<commit_message>
Added lab asset pack and updated dagboek
</commit_message>
<xml_diff>
--- a/Documenten/Dagboek.docx
+++ b/Documenten/Dagboek.docx
@@ -1281,27 +1281,118 @@
           <w:szCs w:val="36"/>
           <w:lang w:val="nl-NL"/>
         </w:rPr>
-        <w:t>Donderdag</w:t>
-      </w:r>
-      <w:r>
-        <w:rPr>
-          <w:b/>
-          <w:bCs/>
-          <w:sz w:val="36"/>
-          <w:szCs w:val="36"/>
-          <w:lang w:val="nl-NL"/>
-        </w:rPr>
-        <w:t xml:space="preserve"> 2</w:t>
-      </w:r>
-      <w:r>
-        <w:rPr>
-          <w:b/>
-          <w:bCs/>
-          <w:sz w:val="36"/>
-          <w:szCs w:val="36"/>
-          <w:lang w:val="nl-NL"/>
-        </w:rPr>
-        <w:t>6</w:t>
+        <w:t>Donderdag 26 Maart</w:t>
+      </w:r>
+    </w:p>
+    <w:p>
+      <w:pPr>
+        <w:rPr>
+          <w:sz w:val="28"/>
+          <w:szCs w:val="28"/>
+          <w:lang w:val="nl-NL"/>
+        </w:rPr>
+      </w:pPr>
+      <w:r>
+        <w:rPr>
+          <w:sz w:val="28"/>
+          <w:szCs w:val="28"/>
+          <w:lang w:val="nl-NL"/>
+        </w:rPr>
+        <w:t>Vandaag heb ik aan mijn portfolio gewerkt en de biologie pagine gebouwt.</w:t>
+      </w:r>
+    </w:p>
+    <w:p>
+      <w:pPr>
+        <w:rPr>
+          <w:sz w:val="28"/>
+          <w:szCs w:val="28"/>
+          <w:lang w:val="nl-NL"/>
+        </w:rPr>
+      </w:pPr>
+    </w:p>
+    <w:p>
+      <w:pPr>
+        <w:rPr>
+          <w:sz w:val="28"/>
+          <w:szCs w:val="28"/>
+          <w:lang w:val="nl-NL"/>
+        </w:rPr>
+      </w:pPr>
+      <w:r>
+        <w:rPr>
+          <w:b/>
+          <w:bCs/>
+          <w:sz w:val="36"/>
+          <w:szCs w:val="36"/>
+          <w:lang w:val="nl-NL"/>
+        </w:rPr>
+        <w:lastRenderedPageBreak/>
+        <w:t>Vrijdag 27 Maart</w:t>
+      </w:r>
+    </w:p>
+    <w:p>
+      <w:pPr>
+        <w:rPr>
+          <w:sz w:val="28"/>
+          <w:szCs w:val="28"/>
+          <w:lang w:val="nl-NL"/>
+        </w:rPr>
+      </w:pPr>
+      <w:r>
+        <w:rPr>
+          <w:sz w:val="28"/>
+          <w:szCs w:val="28"/>
+          <w:lang w:val="nl-NL"/>
+        </w:rPr>
+        <w:t>Vandaag heb ik de rest van mijn portfolio gemaakt en heb ik referentie foto’s genomen voor de map in de biologie minigame.</w:t>
+      </w:r>
+    </w:p>
+    <w:p>
+      <w:pPr>
+        <w:rPr>
+          <w:sz w:val="28"/>
+          <w:szCs w:val="28"/>
+          <w:lang w:val="nl-NL"/>
+        </w:rPr>
+      </w:pPr>
+    </w:p>
+    <w:p>
+      <w:pPr>
+        <w:rPr>
+          <w:sz w:val="28"/>
+          <w:szCs w:val="28"/>
+          <w:lang w:val="nl-NL"/>
+        </w:rPr>
+      </w:pPr>
+      <w:r>
+        <w:rPr>
+          <w:b/>
+          <w:bCs/>
+          <w:sz w:val="36"/>
+          <w:szCs w:val="36"/>
+          <w:lang w:val="nl-NL"/>
+        </w:rPr>
+        <w:t>Maan</w:t>
+      </w:r>
+      <w:r>
+        <w:rPr>
+          <w:b/>
+          <w:bCs/>
+          <w:sz w:val="36"/>
+          <w:szCs w:val="36"/>
+          <w:lang w:val="nl-NL"/>
+        </w:rPr>
+        <w:t xml:space="preserve">dag </w:t>
+      </w:r>
+      <w:r>
+        <w:rPr>
+          <w:b/>
+          <w:bCs/>
+          <w:sz w:val="36"/>
+          <w:szCs w:val="36"/>
+          <w:lang w:val="nl-NL"/>
+        </w:rPr>
+        <w:t>30</w:t>
       </w:r>
       <w:r>
         <w:rPr>
@@ -1328,84 +1419,17 @@
           <w:szCs w:val="28"/>
           <w:lang w:val="nl-NL"/>
         </w:rPr>
-        <w:t>Vandaag heb ik aan mijn portfolio gewerkt en de biologie pagine gebouwt.</w:t>
-      </w:r>
-    </w:p>
-    <w:p>
-      <w:pPr>
-        <w:rPr>
-          <w:sz w:val="28"/>
-          <w:szCs w:val="28"/>
-          <w:lang w:val="nl-NL"/>
-        </w:rPr>
-      </w:pPr>
-    </w:p>
-    <w:p>
-      <w:pPr>
-        <w:rPr>
-          <w:sz w:val="28"/>
-          <w:szCs w:val="28"/>
-          <w:lang w:val="nl-NL"/>
-        </w:rPr>
-      </w:pPr>
-      <w:r>
-        <w:rPr>
-          <w:b/>
-          <w:bCs/>
-          <w:sz w:val="36"/>
-          <w:szCs w:val="36"/>
-          <w:lang w:val="nl-NL"/>
-        </w:rPr>
-        <w:lastRenderedPageBreak/>
-        <w:t>Vrijdag</w:t>
-      </w:r>
-      <w:r>
-        <w:rPr>
-          <w:b/>
-          <w:bCs/>
-          <w:sz w:val="36"/>
-          <w:szCs w:val="36"/>
-          <w:lang w:val="nl-NL"/>
-        </w:rPr>
-        <w:t xml:space="preserve"> 2</w:t>
-      </w:r>
-      <w:r>
-        <w:rPr>
-          <w:b/>
-          <w:bCs/>
-          <w:sz w:val="36"/>
-          <w:szCs w:val="36"/>
-          <w:lang w:val="nl-NL"/>
-        </w:rPr>
-        <w:t>7</w:t>
-      </w:r>
-      <w:r>
-        <w:rPr>
-          <w:b/>
-          <w:bCs/>
-          <w:sz w:val="36"/>
-          <w:szCs w:val="36"/>
-          <w:lang w:val="nl-NL"/>
-        </w:rPr>
-        <w:t xml:space="preserve"> Maart</w:t>
-      </w:r>
-    </w:p>
-    <w:p>
-      <w:pPr>
-        <w:rPr>
-          <w:sz w:val="28"/>
-          <w:szCs w:val="28"/>
-          <w:lang w:val="nl-NL"/>
-        </w:rPr>
-      </w:pPr>
-      <w:r>
-        <w:rPr>
-          <w:sz w:val="28"/>
-          <w:szCs w:val="28"/>
-          <w:lang w:val="nl-NL"/>
-        </w:rPr>
-        <w:t>Vandaag heb ik de rest van mijn portfolio gemaakt en heb ik referentie foto’s genomen voor de map in de biologie minigame.</w:t>
-      </w:r>
+        <w:t>Vandaag heb ik gesolliciteerd voor stage bij SimCenMar, XRLabs en Parallel. Ook heb ik vandaag met Hofland gezeten om te bespreken over de PAP aangezien hij het enorm druk had vrijdag.</w:t>
+      </w:r>
+    </w:p>
+    <w:p>
+      <w:pPr>
+        <w:rPr>
+          <w:sz w:val="28"/>
+          <w:szCs w:val="28"/>
+          <w:lang w:val="nl-NL"/>
+        </w:rPr>
+      </w:pPr>
     </w:p>
     <w:sectPr>
       <w:pgSz w:w="12240" w:h="15840"/>

</xml_diff>

<commit_message>
Added art for biology minigame
</commit_message>
<xml_diff>
--- a/Documenten/Dagboek.docx
+++ b/Documenten/Dagboek.docx
@@ -79,7 +79,25 @@
           <w:szCs w:val="28"/>
           <w:lang w:val="nl-NL"/>
         </w:rPr>
-        <w:t>ag gehad ik kreeg een plekje in een kleine kamer die ze hadden. Verder hebben we besproken waar ik aan ga werken. Dat gaat een Serious game zijn voor hun arcadekast en daar gaan we ook mijn eerste leerdoel op laten richten aangezien ik meer Unreal engine wil leren en dat de perfecte kans is voor mij is.</w:t>
+        <w:t xml:space="preserve">ag gehad ik kreeg een plekje in een kleine kamer die ze hadden. Verder hebben we besproken waar ik aan ga werken. Dat gaat een </w:t>
+      </w:r>
+      <w:proofErr w:type="spellStart"/>
+      <w:r>
+        <w:rPr>
+          <w:sz w:val="28"/>
+          <w:szCs w:val="28"/>
+          <w:lang w:val="nl-NL"/>
+        </w:rPr>
+        <w:t>Serious</w:t>
+      </w:r>
+      <w:proofErr w:type="spellEnd"/>
+      <w:r>
+        <w:rPr>
+          <w:sz w:val="28"/>
+          <w:szCs w:val="28"/>
+          <w:lang w:val="nl-NL"/>
+        </w:rPr>
+        <w:t xml:space="preserve"> game zijn voor hun arcadekast en daar gaan we ook mijn eerste leerdoel op laten richten aangezien ik meer Unreal engine wil leren en dat de perfecte kans is voor mij is.</w:t>
       </w:r>
     </w:p>
     <w:p>
@@ -389,7 +407,25 @@
           <w:szCs w:val="28"/>
           <w:lang w:val="nl-NL"/>
         </w:rPr>
-        <w:t>Vandaag ben ik bezig geweest met bugfixes rond de UI omdat dat nog niet helemaal werkt. Net zoals elke andere Donderdag werk ik vandaag vanuit huis.</w:t>
+        <w:t xml:space="preserve">Vandaag ben ik bezig geweest met </w:t>
+      </w:r>
+      <w:proofErr w:type="spellStart"/>
+      <w:r>
+        <w:rPr>
+          <w:sz w:val="28"/>
+          <w:szCs w:val="28"/>
+          <w:lang w:val="nl-NL"/>
+        </w:rPr>
+        <w:t>bugfixes</w:t>
+      </w:r>
+      <w:proofErr w:type="spellEnd"/>
+      <w:r>
+        <w:rPr>
+          <w:sz w:val="28"/>
+          <w:szCs w:val="28"/>
+          <w:lang w:val="nl-NL"/>
+        </w:rPr>
+        <w:t xml:space="preserve"> rond de UI omdat dat nog niet helemaal werkt. Net zoals elke andere Donderdag werk ik vandaag vanuit huis.</w:t>
       </w:r>
     </w:p>
     <w:p>
@@ -434,7 +470,25 @@
           <w:szCs w:val="28"/>
           <w:lang w:val="nl-NL"/>
         </w:rPr>
-        <w:t>Vandaag heb ik nog meer bugfixes gedaan. Naast dat heb ik ook gezeten met meneer Hofland om te kijken hoe de week is gegaan. Daaruit kwam dat ik meer moet letten op mijn GitHub en Trello omdat ik deze week daar niet enorm op heb gelet.</w:t>
+        <w:t xml:space="preserve">Vandaag heb ik nog meer </w:t>
+      </w:r>
+      <w:proofErr w:type="spellStart"/>
+      <w:r>
+        <w:rPr>
+          <w:sz w:val="28"/>
+          <w:szCs w:val="28"/>
+          <w:lang w:val="nl-NL"/>
+        </w:rPr>
+        <w:t>bugfixes</w:t>
+      </w:r>
+      <w:proofErr w:type="spellEnd"/>
+      <w:r>
+        <w:rPr>
+          <w:sz w:val="28"/>
+          <w:szCs w:val="28"/>
+          <w:lang w:val="nl-NL"/>
+        </w:rPr>
+        <w:t xml:space="preserve"> gedaan. Naast dat heb ik ook gezeten met meneer Hofland om te kijken hoe de week is gegaan. Daaruit kwam dat ik meer moet letten op mijn GitHub en Trello omdat ik deze week daar niet enorm op heb gelet.</w:t>
       </w:r>
     </w:p>
     <w:p>
@@ -801,7 +855,25 @@
           <w:szCs w:val="28"/>
           <w:lang w:val="nl-NL"/>
         </w:rPr>
-        <w:t>Vandaag heb ik de geschiedenis minigame afgerond en 1 playtest gedaan met meneer Dukers omdat meneer koppelaar niet aanwezig was vandaag.</w:t>
+        <w:t xml:space="preserve">Vandaag heb ik de geschiedenis minigame afgerond en 1 </w:t>
+      </w:r>
+      <w:proofErr w:type="spellStart"/>
+      <w:r>
+        <w:rPr>
+          <w:sz w:val="28"/>
+          <w:szCs w:val="28"/>
+          <w:lang w:val="nl-NL"/>
+        </w:rPr>
+        <w:t>playtest</w:t>
+      </w:r>
+      <w:proofErr w:type="spellEnd"/>
+      <w:r>
+        <w:rPr>
+          <w:sz w:val="28"/>
+          <w:szCs w:val="28"/>
+          <w:lang w:val="nl-NL"/>
+        </w:rPr>
+        <w:t xml:space="preserve"> gedaan met meneer Dukers omdat meneer koppelaar niet aanwezig was vandaag.</w:t>
       </w:r>
     </w:p>
     <w:p>
@@ -846,7 +918,43 @@
           <w:szCs w:val="28"/>
           <w:lang w:val="nl-NL"/>
         </w:rPr>
-        <w:t>Vandaag ben ik op het idee gekomen voor de biologie minigame. Daaruit kwam dat het een game beetje zoals Overcooked gaat worden waar je cellen moet mixen en matchen om de correcte cel te krijgen. Ook heb ik de playtest met meneer koppelaar gedaan. Dat was allemaal heel succesvol gelukt.</w:t>
+        <w:t xml:space="preserve">Vandaag ben ik op het idee gekomen voor de biologie minigame. Daaruit kwam dat het een game beetje zoals </w:t>
+      </w:r>
+      <w:proofErr w:type="spellStart"/>
+      <w:r>
+        <w:rPr>
+          <w:sz w:val="28"/>
+          <w:szCs w:val="28"/>
+          <w:lang w:val="nl-NL"/>
+        </w:rPr>
+        <w:t>Overcooked</w:t>
+      </w:r>
+      <w:proofErr w:type="spellEnd"/>
+      <w:r>
+        <w:rPr>
+          <w:sz w:val="28"/>
+          <w:szCs w:val="28"/>
+          <w:lang w:val="nl-NL"/>
+        </w:rPr>
+        <w:t xml:space="preserve"> gaat worden waar je cellen moet mixen en matchen om de correcte cel te krijgen. Ook heb ik de </w:t>
+      </w:r>
+      <w:proofErr w:type="spellStart"/>
+      <w:r>
+        <w:rPr>
+          <w:sz w:val="28"/>
+          <w:szCs w:val="28"/>
+          <w:lang w:val="nl-NL"/>
+        </w:rPr>
+        <w:t>playtest</w:t>
+      </w:r>
+      <w:proofErr w:type="spellEnd"/>
+      <w:r>
+        <w:rPr>
+          <w:sz w:val="28"/>
+          <w:szCs w:val="28"/>
+          <w:lang w:val="nl-NL"/>
+        </w:rPr>
+        <w:t xml:space="preserve"> met meneer koppelaar gedaan. Dat was allemaal heel succesvol gelukt.</w:t>
       </w:r>
     </w:p>
     <w:p>
@@ -1026,7 +1134,43 @@
           <w:szCs w:val="28"/>
           <w:lang w:val="nl-NL"/>
         </w:rPr>
-        <w:t>Vandaag heb ik veel progressie gemaakt naar het prototype van de biologie minigame waaronder het hele gedoe van dingen oppakken en in je inventory stoppen ook heb ik een start gemaakt aan het gedoe van spullen op het crafting bureau gemaakt dus dat.</w:t>
+        <w:t xml:space="preserve">Vandaag heb ik veel progressie gemaakt naar het prototype van de biologie minigame waaronder het hele gedoe van dingen oppakken en in je </w:t>
+      </w:r>
+      <w:proofErr w:type="spellStart"/>
+      <w:r>
+        <w:rPr>
+          <w:sz w:val="28"/>
+          <w:szCs w:val="28"/>
+          <w:lang w:val="nl-NL"/>
+        </w:rPr>
+        <w:t>inventory</w:t>
+      </w:r>
+      <w:proofErr w:type="spellEnd"/>
+      <w:r>
+        <w:rPr>
+          <w:sz w:val="28"/>
+          <w:szCs w:val="28"/>
+          <w:lang w:val="nl-NL"/>
+        </w:rPr>
+        <w:t xml:space="preserve"> stoppen ook heb ik een start gemaakt aan het gedoe van spullen op het </w:t>
+      </w:r>
+      <w:proofErr w:type="spellStart"/>
+      <w:r>
+        <w:rPr>
+          <w:sz w:val="28"/>
+          <w:szCs w:val="28"/>
+          <w:lang w:val="nl-NL"/>
+        </w:rPr>
+        <w:t>crafting</w:t>
+      </w:r>
+      <w:proofErr w:type="spellEnd"/>
+      <w:r>
+        <w:rPr>
+          <w:sz w:val="28"/>
+          <w:szCs w:val="28"/>
+          <w:lang w:val="nl-NL"/>
+        </w:rPr>
+        <w:t xml:space="preserve"> bureau gemaakt dus dat.</w:t>
       </w:r>
       <w:r>
         <w:rPr>
@@ -1069,8 +1213,54 @@
           <w:szCs w:val="28"/>
           <w:lang w:val="nl-NL"/>
         </w:rPr>
-        <w:t>Vandaag heb ik veel progressie gemaakt richting de core mechanics van de biologie game waaronder het oppakken en neerzetten van objecten en het systeem van de crafting table</w:t>
-      </w:r>
+        <w:t xml:space="preserve">Vandaag heb ik veel progressie gemaakt richting de </w:t>
+      </w:r>
+      <w:proofErr w:type="spellStart"/>
+      <w:r>
+        <w:rPr>
+          <w:sz w:val="28"/>
+          <w:szCs w:val="28"/>
+          <w:lang w:val="nl-NL"/>
+        </w:rPr>
+        <w:t>core</w:t>
+      </w:r>
+      <w:proofErr w:type="spellEnd"/>
+      <w:r>
+        <w:rPr>
+          <w:sz w:val="28"/>
+          <w:szCs w:val="28"/>
+          <w:lang w:val="nl-NL"/>
+        </w:rPr>
+        <w:t xml:space="preserve"> mechanics van de biologie game waaronder het oppakken en neerzetten van objecten en het systeem van de </w:t>
+      </w:r>
+      <w:proofErr w:type="spellStart"/>
+      <w:r>
+        <w:rPr>
+          <w:sz w:val="28"/>
+          <w:szCs w:val="28"/>
+          <w:lang w:val="nl-NL"/>
+        </w:rPr>
+        <w:t>crafting</w:t>
+      </w:r>
+      <w:proofErr w:type="spellEnd"/>
+      <w:r>
+        <w:rPr>
+          <w:sz w:val="28"/>
+          <w:szCs w:val="28"/>
+          <w:lang w:val="nl-NL"/>
+        </w:rPr>
+        <w:t xml:space="preserve"> </w:t>
+      </w:r>
+      <w:proofErr w:type="spellStart"/>
+      <w:r>
+        <w:rPr>
+          <w:sz w:val="28"/>
+          <w:szCs w:val="28"/>
+          <w:lang w:val="nl-NL"/>
+        </w:rPr>
+        <w:t>table</w:t>
+      </w:r>
+      <w:proofErr w:type="spellEnd"/>
       <w:r>
         <w:rPr>
           <w:sz w:val="28"/>
@@ -1138,7 +1328,25 @@
           <w:szCs w:val="28"/>
           <w:lang w:val="nl-NL"/>
         </w:rPr>
-        <w:t xml:space="preserve">tijd zitten bug fixen rondom de crafting mechanic. Ook heb ik </w:t>
+        <w:t xml:space="preserve">tijd zitten bug fixen rondom de </w:t>
+      </w:r>
+      <w:proofErr w:type="spellStart"/>
+      <w:r>
+        <w:rPr>
+          <w:sz w:val="28"/>
+          <w:szCs w:val="28"/>
+          <w:lang w:val="nl-NL"/>
+        </w:rPr>
+        <w:t>crafting</w:t>
+      </w:r>
+      <w:proofErr w:type="spellEnd"/>
+      <w:r>
+        <w:rPr>
+          <w:sz w:val="28"/>
+          <w:szCs w:val="28"/>
+          <w:lang w:val="nl-NL"/>
+        </w:rPr>
+        <w:t xml:space="preserve"> mechanic. Ook heb ik </w:t>
       </w:r>
       <w:r>
         <w:rPr>
@@ -1298,7 +1506,43 @@
           <w:szCs w:val="28"/>
           <w:lang w:val="nl-NL"/>
         </w:rPr>
-        <w:t>Vandaag heb ik aan mijn portfolio gewerkt en de biologie pagine gebouwt.</w:t>
+        <w:t xml:space="preserve">Vandaag heb ik aan mijn portfolio gewerkt en de biologie </w:t>
+      </w:r>
+      <w:proofErr w:type="spellStart"/>
+      <w:r>
+        <w:rPr>
+          <w:sz w:val="28"/>
+          <w:szCs w:val="28"/>
+          <w:lang w:val="nl-NL"/>
+        </w:rPr>
+        <w:t>pagine</w:t>
+      </w:r>
+      <w:proofErr w:type="spellEnd"/>
+      <w:r>
+        <w:rPr>
+          <w:sz w:val="28"/>
+          <w:szCs w:val="28"/>
+          <w:lang w:val="nl-NL"/>
+        </w:rPr>
+        <w:t xml:space="preserve"> </w:t>
+      </w:r>
+      <w:proofErr w:type="spellStart"/>
+      <w:r>
+        <w:rPr>
+          <w:sz w:val="28"/>
+          <w:szCs w:val="28"/>
+          <w:lang w:val="nl-NL"/>
+        </w:rPr>
+        <w:t>gebouwt</w:t>
+      </w:r>
+      <w:proofErr w:type="spellEnd"/>
+      <w:r>
+        <w:rPr>
+          <w:sz w:val="28"/>
+          <w:szCs w:val="28"/>
+          <w:lang w:val="nl-NL"/>
+        </w:rPr>
+        <w:t>.</w:t>
       </w:r>
     </w:p>
     <w:p>
@@ -1372,7 +1616,179 @@
           <w:szCs w:val="36"/>
           <w:lang w:val="nl-NL"/>
         </w:rPr>
-        <w:t>Maan</w:t>
+        <w:t>Maandag 30 Maart</w:t>
+      </w:r>
+    </w:p>
+    <w:p>
+      <w:pPr>
+        <w:rPr>
+          <w:sz w:val="28"/>
+          <w:szCs w:val="28"/>
+          <w:lang w:val="nl-NL"/>
+        </w:rPr>
+      </w:pPr>
+      <w:r>
+        <w:rPr>
+          <w:sz w:val="28"/>
+          <w:szCs w:val="28"/>
+          <w:lang w:val="nl-NL"/>
+        </w:rPr>
+        <w:t xml:space="preserve">Vandaag heb ik gesolliciteerd voor stage bij </w:t>
+      </w:r>
+      <w:proofErr w:type="spellStart"/>
+      <w:r>
+        <w:rPr>
+          <w:sz w:val="28"/>
+          <w:szCs w:val="28"/>
+          <w:lang w:val="nl-NL"/>
+        </w:rPr>
+        <w:t>SimCenMar</w:t>
+      </w:r>
+      <w:proofErr w:type="spellEnd"/>
+      <w:r>
+        <w:rPr>
+          <w:sz w:val="28"/>
+          <w:szCs w:val="28"/>
+          <w:lang w:val="nl-NL"/>
+        </w:rPr>
+        <w:t xml:space="preserve">, </w:t>
+      </w:r>
+      <w:proofErr w:type="spellStart"/>
+      <w:r>
+        <w:rPr>
+          <w:sz w:val="28"/>
+          <w:szCs w:val="28"/>
+          <w:lang w:val="nl-NL"/>
+        </w:rPr>
+        <w:t>XRLabs</w:t>
+      </w:r>
+      <w:proofErr w:type="spellEnd"/>
+      <w:r>
+        <w:rPr>
+          <w:sz w:val="28"/>
+          <w:szCs w:val="28"/>
+          <w:lang w:val="nl-NL"/>
+        </w:rPr>
+        <w:t xml:space="preserve"> en Parallel. Ook heb ik vandaag met Hofland gezeten om te bespreken over de PAP aangezien hij het enorm druk had vrijdag.</w:t>
+      </w:r>
+    </w:p>
+    <w:p>
+      <w:pPr>
+        <w:rPr>
+          <w:sz w:val="28"/>
+          <w:szCs w:val="28"/>
+          <w:lang w:val="nl-NL"/>
+        </w:rPr>
+      </w:pPr>
+    </w:p>
+    <w:p>
+      <w:pPr>
+        <w:rPr>
+          <w:sz w:val="28"/>
+          <w:szCs w:val="28"/>
+          <w:lang w:val="nl-NL"/>
+        </w:rPr>
+      </w:pPr>
+      <w:r>
+        <w:rPr>
+          <w:b/>
+          <w:bCs/>
+          <w:sz w:val="36"/>
+          <w:szCs w:val="36"/>
+          <w:lang w:val="nl-NL"/>
+        </w:rPr>
+        <w:t>Dins</w:t>
+      </w:r>
+      <w:r>
+        <w:rPr>
+          <w:b/>
+          <w:bCs/>
+          <w:sz w:val="36"/>
+          <w:szCs w:val="36"/>
+          <w:lang w:val="nl-NL"/>
+        </w:rPr>
+        <w:t>dag 3</w:t>
+      </w:r>
+      <w:r>
+        <w:rPr>
+          <w:b/>
+          <w:bCs/>
+          <w:sz w:val="36"/>
+          <w:szCs w:val="36"/>
+          <w:lang w:val="nl-NL"/>
+        </w:rPr>
+        <w:t>1</w:t>
+      </w:r>
+      <w:r>
+        <w:rPr>
+          <w:b/>
+          <w:bCs/>
+          <w:sz w:val="36"/>
+          <w:szCs w:val="36"/>
+          <w:lang w:val="nl-NL"/>
+        </w:rPr>
+        <w:t xml:space="preserve"> Maart</w:t>
+      </w:r>
+    </w:p>
+    <w:p>
+      <w:pPr>
+        <w:rPr>
+          <w:sz w:val="28"/>
+          <w:szCs w:val="28"/>
+          <w:lang w:val="nl-NL"/>
+        </w:rPr>
+      </w:pPr>
+      <w:r>
+        <w:rPr>
+          <w:sz w:val="28"/>
+          <w:szCs w:val="28"/>
+          <w:lang w:val="nl-NL"/>
+        </w:rPr>
+        <w:t xml:space="preserve">Vandaag heb ik mijn PAP </w:t>
+      </w:r>
+      <w:r>
+        <w:rPr>
+          <w:sz w:val="28"/>
+          <w:szCs w:val="28"/>
+          <w:lang w:val="nl-NL"/>
+        </w:rPr>
+        <w:t>geüpdatet</w:t>
+      </w:r>
+      <w:r>
+        <w:rPr>
+          <w:sz w:val="28"/>
+          <w:szCs w:val="28"/>
+          <w:lang w:val="nl-NL"/>
+        </w:rPr>
+        <w:t xml:space="preserve"> en ben ik begonnen aan de art voor de biologie minigame.</w:t>
+      </w:r>
+    </w:p>
+    <w:p>
+      <w:pPr>
+        <w:rPr>
+          <w:sz w:val="28"/>
+          <w:szCs w:val="28"/>
+          <w:lang w:val="nl-NL"/>
+        </w:rPr>
+      </w:pPr>
+    </w:p>
+    <w:p>
+      <w:pPr>
+        <w:rPr>
+          <w:sz w:val="28"/>
+          <w:szCs w:val="28"/>
+          <w:lang w:val="nl-NL"/>
+        </w:rPr>
+      </w:pPr>
+      <w:r>
+        <w:rPr>
+          <w:b/>
+          <w:bCs/>
+          <w:sz w:val="36"/>
+          <w:szCs w:val="36"/>
+          <w:lang w:val="nl-NL"/>
+        </w:rPr>
+        <w:t>Woens</w:t>
       </w:r>
       <w:r>
         <w:rPr>
@@ -1392,34 +1808,24 @@
           <w:szCs w:val="36"/>
           <w:lang w:val="nl-NL"/>
         </w:rPr>
-        <w:t>30</w:t>
-      </w:r>
-      <w:r>
-        <w:rPr>
-          <w:b/>
-          <w:bCs/>
-          <w:sz w:val="36"/>
-          <w:szCs w:val="36"/>
-          <w:lang w:val="nl-NL"/>
-        </w:rPr>
-        <w:t xml:space="preserve"> Maart</w:t>
-      </w:r>
-    </w:p>
-    <w:p>
-      <w:pPr>
-        <w:rPr>
-          <w:sz w:val="28"/>
-          <w:szCs w:val="28"/>
-          <w:lang w:val="nl-NL"/>
-        </w:rPr>
-      </w:pPr>
-      <w:r>
-        <w:rPr>
-          <w:sz w:val="28"/>
-          <w:szCs w:val="28"/>
-          <w:lang w:val="nl-NL"/>
-        </w:rPr>
-        <w:t>Vandaag heb ik gesolliciteerd voor stage bij SimCenMar, XRLabs en Parallel. Ook heb ik vandaag met Hofland gezeten om te bespreken over de PAP aangezien hij het enorm druk had vrijdag.</w:t>
+        <w:t>1 April</w:t>
+      </w:r>
+    </w:p>
+    <w:p>
+      <w:pPr>
+        <w:rPr>
+          <w:sz w:val="28"/>
+          <w:szCs w:val="28"/>
+          <w:lang w:val="nl-NL"/>
+        </w:rPr>
+      </w:pPr>
+      <w:r>
+        <w:rPr>
+          <w:sz w:val="28"/>
+          <w:szCs w:val="28"/>
+          <w:lang w:val="nl-NL"/>
+        </w:rPr>
+        <w:t>Vandaag heb ik enorm veel progressie gemaakt tot de art in de biologie minigame en heb ik een mail gestuurd naar de stage bij de landmacht.</w:t>
       </w:r>
     </w:p>
     <w:p>

</xml_diff>

<commit_message>
added recipe book, Dash and tutorial
</commit_message>
<xml_diff>
--- a/Documenten/Dagboek.docx
+++ b/Documenten/Dagboek.docx
@@ -79,25 +79,7 @@
           <w:szCs w:val="28"/>
           <w:lang w:val="nl-NL"/>
         </w:rPr>
-        <w:t xml:space="preserve">ag gehad ik kreeg een plekje in een kleine kamer die ze hadden. Verder hebben we besproken waar ik aan ga werken. Dat gaat een </w:t>
-      </w:r>
-      <w:proofErr w:type="spellStart"/>
-      <w:r>
-        <w:rPr>
-          <w:sz w:val="28"/>
-          <w:szCs w:val="28"/>
-          <w:lang w:val="nl-NL"/>
-        </w:rPr>
-        <w:t>Serious</w:t>
-      </w:r>
-      <w:proofErr w:type="spellEnd"/>
-      <w:r>
-        <w:rPr>
-          <w:sz w:val="28"/>
-          <w:szCs w:val="28"/>
-          <w:lang w:val="nl-NL"/>
-        </w:rPr>
-        <w:t xml:space="preserve"> game zijn voor hun arcadekast en daar gaan we ook mijn eerste leerdoel op laten richten aangezien ik meer Unreal engine wil leren en dat de perfecte kans is voor mij is.</w:t>
+        <w:t>ag gehad ik kreeg een plekje in een kleine kamer die ze hadden. Verder hebben we besproken waar ik aan ga werken. Dat gaat een Serious game zijn voor hun arcadekast en daar gaan we ook mijn eerste leerdoel op laten richten aangezien ik meer Unreal engine wil leren en dat de perfecte kans is voor mij is.</w:t>
       </w:r>
     </w:p>
     <w:p>
@@ -407,25 +389,7 @@
           <w:szCs w:val="28"/>
           <w:lang w:val="nl-NL"/>
         </w:rPr>
-        <w:t xml:space="preserve">Vandaag ben ik bezig geweest met </w:t>
-      </w:r>
-      <w:proofErr w:type="spellStart"/>
-      <w:r>
-        <w:rPr>
-          <w:sz w:val="28"/>
-          <w:szCs w:val="28"/>
-          <w:lang w:val="nl-NL"/>
-        </w:rPr>
-        <w:t>bugfixes</w:t>
-      </w:r>
-      <w:proofErr w:type="spellEnd"/>
-      <w:r>
-        <w:rPr>
-          <w:sz w:val="28"/>
-          <w:szCs w:val="28"/>
-          <w:lang w:val="nl-NL"/>
-        </w:rPr>
-        <w:t xml:space="preserve"> rond de UI omdat dat nog niet helemaal werkt. Net zoals elke andere Donderdag werk ik vandaag vanuit huis.</w:t>
+        <w:t>Vandaag ben ik bezig geweest met bugfixes rond de UI omdat dat nog niet helemaal werkt. Net zoals elke andere Donderdag werk ik vandaag vanuit huis.</w:t>
       </w:r>
     </w:p>
     <w:p>
@@ -470,25 +434,7 @@
           <w:szCs w:val="28"/>
           <w:lang w:val="nl-NL"/>
         </w:rPr>
-        <w:t xml:space="preserve">Vandaag heb ik nog meer </w:t>
-      </w:r>
-      <w:proofErr w:type="spellStart"/>
-      <w:r>
-        <w:rPr>
-          <w:sz w:val="28"/>
-          <w:szCs w:val="28"/>
-          <w:lang w:val="nl-NL"/>
-        </w:rPr>
-        <w:t>bugfixes</w:t>
-      </w:r>
-      <w:proofErr w:type="spellEnd"/>
-      <w:r>
-        <w:rPr>
-          <w:sz w:val="28"/>
-          <w:szCs w:val="28"/>
-          <w:lang w:val="nl-NL"/>
-        </w:rPr>
-        <w:t xml:space="preserve"> gedaan. Naast dat heb ik ook gezeten met meneer Hofland om te kijken hoe de week is gegaan. Daaruit kwam dat ik meer moet letten op mijn GitHub en Trello omdat ik deze week daar niet enorm op heb gelet.</w:t>
+        <w:t>Vandaag heb ik nog meer bugfixes gedaan. Naast dat heb ik ook gezeten met meneer Hofland om te kijken hoe de week is gegaan. Daaruit kwam dat ik meer moet letten op mijn GitHub en Trello omdat ik deze week daar niet enorm op heb gelet.</w:t>
       </w:r>
     </w:p>
     <w:p>
@@ -855,25 +801,7 @@
           <w:szCs w:val="28"/>
           <w:lang w:val="nl-NL"/>
         </w:rPr>
-        <w:t xml:space="preserve">Vandaag heb ik de geschiedenis minigame afgerond en 1 </w:t>
-      </w:r>
-      <w:proofErr w:type="spellStart"/>
-      <w:r>
-        <w:rPr>
-          <w:sz w:val="28"/>
-          <w:szCs w:val="28"/>
-          <w:lang w:val="nl-NL"/>
-        </w:rPr>
-        <w:t>playtest</w:t>
-      </w:r>
-      <w:proofErr w:type="spellEnd"/>
-      <w:r>
-        <w:rPr>
-          <w:sz w:val="28"/>
-          <w:szCs w:val="28"/>
-          <w:lang w:val="nl-NL"/>
-        </w:rPr>
-        <w:t xml:space="preserve"> gedaan met meneer Dukers omdat meneer koppelaar niet aanwezig was vandaag.</w:t>
+        <w:t>Vandaag heb ik de geschiedenis minigame afgerond en 1 playtest gedaan met meneer Dukers omdat meneer koppelaar niet aanwezig was vandaag.</w:t>
       </w:r>
     </w:p>
     <w:p>
@@ -918,43 +846,7 @@
           <w:szCs w:val="28"/>
           <w:lang w:val="nl-NL"/>
         </w:rPr>
-        <w:t xml:space="preserve">Vandaag ben ik op het idee gekomen voor de biologie minigame. Daaruit kwam dat het een game beetje zoals </w:t>
-      </w:r>
-      <w:proofErr w:type="spellStart"/>
-      <w:r>
-        <w:rPr>
-          <w:sz w:val="28"/>
-          <w:szCs w:val="28"/>
-          <w:lang w:val="nl-NL"/>
-        </w:rPr>
-        <w:t>Overcooked</w:t>
-      </w:r>
-      <w:proofErr w:type="spellEnd"/>
-      <w:r>
-        <w:rPr>
-          <w:sz w:val="28"/>
-          <w:szCs w:val="28"/>
-          <w:lang w:val="nl-NL"/>
-        </w:rPr>
-        <w:t xml:space="preserve"> gaat worden waar je cellen moet mixen en matchen om de correcte cel te krijgen. Ook heb ik de </w:t>
-      </w:r>
-      <w:proofErr w:type="spellStart"/>
-      <w:r>
-        <w:rPr>
-          <w:sz w:val="28"/>
-          <w:szCs w:val="28"/>
-          <w:lang w:val="nl-NL"/>
-        </w:rPr>
-        <w:t>playtest</w:t>
-      </w:r>
-      <w:proofErr w:type="spellEnd"/>
-      <w:r>
-        <w:rPr>
-          <w:sz w:val="28"/>
-          <w:szCs w:val="28"/>
-          <w:lang w:val="nl-NL"/>
-        </w:rPr>
-        <w:t xml:space="preserve"> met meneer koppelaar gedaan. Dat was allemaal heel succesvol gelukt.</w:t>
+        <w:t>Vandaag ben ik op het idee gekomen voor de biologie minigame. Daaruit kwam dat het een game beetje zoals Overcooked gaat worden waar je cellen moet mixen en matchen om de correcte cel te krijgen. Ook heb ik de playtest met meneer koppelaar gedaan. Dat was allemaal heel succesvol gelukt.</w:t>
       </w:r>
     </w:p>
     <w:p>
@@ -1134,43 +1026,7 @@
           <w:szCs w:val="28"/>
           <w:lang w:val="nl-NL"/>
         </w:rPr>
-        <w:t xml:space="preserve">Vandaag heb ik veel progressie gemaakt naar het prototype van de biologie minigame waaronder het hele gedoe van dingen oppakken en in je </w:t>
-      </w:r>
-      <w:proofErr w:type="spellStart"/>
-      <w:r>
-        <w:rPr>
-          <w:sz w:val="28"/>
-          <w:szCs w:val="28"/>
-          <w:lang w:val="nl-NL"/>
-        </w:rPr>
-        <w:t>inventory</w:t>
-      </w:r>
-      <w:proofErr w:type="spellEnd"/>
-      <w:r>
-        <w:rPr>
-          <w:sz w:val="28"/>
-          <w:szCs w:val="28"/>
-          <w:lang w:val="nl-NL"/>
-        </w:rPr>
-        <w:t xml:space="preserve"> stoppen ook heb ik een start gemaakt aan het gedoe van spullen op het </w:t>
-      </w:r>
-      <w:proofErr w:type="spellStart"/>
-      <w:r>
-        <w:rPr>
-          <w:sz w:val="28"/>
-          <w:szCs w:val="28"/>
-          <w:lang w:val="nl-NL"/>
-        </w:rPr>
-        <w:t>crafting</w:t>
-      </w:r>
-      <w:proofErr w:type="spellEnd"/>
-      <w:r>
-        <w:rPr>
-          <w:sz w:val="28"/>
-          <w:szCs w:val="28"/>
-          <w:lang w:val="nl-NL"/>
-        </w:rPr>
-        <w:t xml:space="preserve"> bureau gemaakt dus dat.</w:t>
+        <w:t>Vandaag heb ik veel progressie gemaakt naar het prototype van de biologie minigame waaronder het hele gedoe van dingen oppakken en in je inventory stoppen ook heb ik een start gemaakt aan het gedoe van spullen op het crafting bureau gemaakt dus dat.</w:t>
       </w:r>
       <w:r>
         <w:rPr>
@@ -1213,36 +1069,61 @@
           <w:szCs w:val="28"/>
           <w:lang w:val="nl-NL"/>
         </w:rPr>
-        <w:t xml:space="preserve">Vandaag heb ik veel progressie gemaakt richting de </w:t>
-      </w:r>
-      <w:proofErr w:type="spellStart"/>
-      <w:r>
-        <w:rPr>
-          <w:sz w:val="28"/>
-          <w:szCs w:val="28"/>
-          <w:lang w:val="nl-NL"/>
-        </w:rPr>
-        <w:t>core</w:t>
-      </w:r>
-      <w:proofErr w:type="spellEnd"/>
-      <w:r>
-        <w:rPr>
-          <w:sz w:val="28"/>
-          <w:szCs w:val="28"/>
-          <w:lang w:val="nl-NL"/>
-        </w:rPr>
-        <w:t xml:space="preserve"> mechanics van de biologie game waaronder het oppakken en neerzetten van objecten en het systeem van de </w:t>
-      </w:r>
-      <w:proofErr w:type="spellStart"/>
-      <w:r>
-        <w:rPr>
-          <w:sz w:val="28"/>
-          <w:szCs w:val="28"/>
-          <w:lang w:val="nl-NL"/>
-        </w:rPr>
-        <w:t>crafting</w:t>
-      </w:r>
-      <w:proofErr w:type="spellEnd"/>
+        <w:t>Vandaag heb ik veel progressie gemaakt richting de core mechanics van de biologie game waaronder het oppakken en neerzetten van objecten en het systeem van de crafting table</w:t>
+      </w:r>
+      <w:r>
+        <w:rPr>
+          <w:sz w:val="28"/>
+          <w:szCs w:val="28"/>
+          <w:lang w:val="nl-NL"/>
+        </w:rPr>
+        <w:t xml:space="preserve"> en het mix en matchen van de items die er op neergezet wordt.</w:t>
+      </w:r>
+    </w:p>
+    <w:p>
+      <w:pPr>
+        <w:rPr>
+          <w:sz w:val="28"/>
+          <w:szCs w:val="28"/>
+          <w:lang w:val="nl-NL"/>
+        </w:rPr>
+      </w:pPr>
+    </w:p>
+    <w:p>
+      <w:pPr>
+        <w:rPr>
+          <w:sz w:val="28"/>
+          <w:szCs w:val="28"/>
+          <w:lang w:val="nl-NL"/>
+        </w:rPr>
+      </w:pPr>
+      <w:r>
+        <w:rPr>
+          <w:b/>
+          <w:bCs/>
+          <w:sz w:val="36"/>
+          <w:szCs w:val="36"/>
+          <w:lang w:val="nl-NL"/>
+        </w:rPr>
+        <w:t>Dinsdag 24 Maart</w:t>
+      </w:r>
+    </w:p>
+    <w:p>
+      <w:pPr>
+        <w:rPr>
+          <w:sz w:val="28"/>
+          <w:szCs w:val="28"/>
+          <w:lang w:val="nl-NL"/>
+        </w:rPr>
+      </w:pPr>
+      <w:r>
+        <w:rPr>
+          <w:sz w:val="28"/>
+          <w:szCs w:val="28"/>
+          <w:lang w:val="nl-NL"/>
+        </w:rPr>
+        <w:t>Vandaag heb ik een hele lange</w:t>
+      </w:r>
       <w:r>
         <w:rPr>
           <w:sz w:val="28"/>
@@ -1251,102 +1132,13 @@
         </w:rPr>
         <w:t xml:space="preserve"> </w:t>
       </w:r>
-      <w:proofErr w:type="spellStart"/>
-      <w:r>
-        <w:rPr>
-          <w:sz w:val="28"/>
-          <w:szCs w:val="28"/>
-          <w:lang w:val="nl-NL"/>
-        </w:rPr>
-        <w:t>table</w:t>
-      </w:r>
-      <w:proofErr w:type="spellEnd"/>
-      <w:r>
-        <w:rPr>
-          <w:sz w:val="28"/>
-          <w:szCs w:val="28"/>
-          <w:lang w:val="nl-NL"/>
-        </w:rPr>
-        <w:t xml:space="preserve"> en het mix en matchen van de items die er op neergezet wordt.</w:t>
-      </w:r>
-    </w:p>
-    <w:p>
-      <w:pPr>
-        <w:rPr>
-          <w:sz w:val="28"/>
-          <w:szCs w:val="28"/>
-          <w:lang w:val="nl-NL"/>
-        </w:rPr>
-      </w:pPr>
-    </w:p>
-    <w:p>
-      <w:pPr>
-        <w:rPr>
-          <w:sz w:val="28"/>
-          <w:szCs w:val="28"/>
-          <w:lang w:val="nl-NL"/>
-        </w:rPr>
-      </w:pPr>
-      <w:r>
-        <w:rPr>
-          <w:b/>
-          <w:bCs/>
-          <w:sz w:val="36"/>
-          <w:szCs w:val="36"/>
-          <w:lang w:val="nl-NL"/>
-        </w:rPr>
-        <w:t>Dinsdag 24 Maart</w:t>
-      </w:r>
-    </w:p>
-    <w:p>
-      <w:pPr>
-        <w:rPr>
-          <w:sz w:val="28"/>
-          <w:szCs w:val="28"/>
-          <w:lang w:val="nl-NL"/>
-        </w:rPr>
-      </w:pPr>
-      <w:r>
-        <w:rPr>
-          <w:sz w:val="28"/>
-          <w:szCs w:val="28"/>
-          <w:lang w:val="nl-NL"/>
-        </w:rPr>
-        <w:t>Vandaag heb ik een hele lange</w:t>
-      </w:r>
-      <w:r>
-        <w:rPr>
-          <w:sz w:val="28"/>
-          <w:szCs w:val="28"/>
-          <w:lang w:val="nl-NL"/>
-        </w:rPr>
-        <w:t xml:space="preserve"> </w:t>
-      </w:r>
-      <w:r>
-        <w:rPr>
-          <w:sz w:val="28"/>
-          <w:szCs w:val="28"/>
-          <w:lang w:val="nl-NL"/>
-        </w:rPr>
-        <w:t xml:space="preserve">tijd zitten bug fixen rondom de </w:t>
-      </w:r>
-      <w:proofErr w:type="spellStart"/>
-      <w:r>
-        <w:rPr>
-          <w:sz w:val="28"/>
-          <w:szCs w:val="28"/>
-          <w:lang w:val="nl-NL"/>
-        </w:rPr>
-        <w:t>crafting</w:t>
-      </w:r>
-      <w:proofErr w:type="spellEnd"/>
-      <w:r>
-        <w:rPr>
-          <w:sz w:val="28"/>
-          <w:szCs w:val="28"/>
-          <w:lang w:val="nl-NL"/>
-        </w:rPr>
-        <w:t xml:space="preserve"> mechanic. Ook heb ik </w:t>
+      <w:r>
+        <w:rPr>
+          <w:sz w:val="28"/>
+          <w:szCs w:val="28"/>
+          <w:lang w:val="nl-NL"/>
+        </w:rPr>
+        <w:t xml:space="preserve">tijd zitten bug fixen rondom de crafting mechanic. Ook heb ik </w:t>
       </w:r>
       <w:r>
         <w:rPr>
@@ -1506,43 +1298,7 @@
           <w:szCs w:val="28"/>
           <w:lang w:val="nl-NL"/>
         </w:rPr>
-        <w:t xml:space="preserve">Vandaag heb ik aan mijn portfolio gewerkt en de biologie </w:t>
-      </w:r>
-      <w:proofErr w:type="spellStart"/>
-      <w:r>
-        <w:rPr>
-          <w:sz w:val="28"/>
-          <w:szCs w:val="28"/>
-          <w:lang w:val="nl-NL"/>
-        </w:rPr>
-        <w:t>pagine</w:t>
-      </w:r>
-      <w:proofErr w:type="spellEnd"/>
-      <w:r>
-        <w:rPr>
-          <w:sz w:val="28"/>
-          <w:szCs w:val="28"/>
-          <w:lang w:val="nl-NL"/>
-        </w:rPr>
-        <w:t xml:space="preserve"> </w:t>
-      </w:r>
-      <w:proofErr w:type="spellStart"/>
-      <w:r>
-        <w:rPr>
-          <w:sz w:val="28"/>
-          <w:szCs w:val="28"/>
-          <w:lang w:val="nl-NL"/>
-        </w:rPr>
-        <w:t>gebouwt</w:t>
-      </w:r>
-      <w:proofErr w:type="spellEnd"/>
-      <w:r>
-        <w:rPr>
-          <w:sz w:val="28"/>
-          <w:szCs w:val="28"/>
-          <w:lang w:val="nl-NL"/>
-        </w:rPr>
-        <w:t>.</w:t>
+        <w:t>Vandaag heb ik aan mijn portfolio gewerkt en de biologie pagine gebouwt.</w:t>
       </w:r>
     </w:p>
     <w:p>
@@ -1633,43 +1389,7 @@
           <w:szCs w:val="28"/>
           <w:lang w:val="nl-NL"/>
         </w:rPr>
-        <w:t xml:space="preserve">Vandaag heb ik gesolliciteerd voor stage bij </w:t>
-      </w:r>
-      <w:proofErr w:type="spellStart"/>
-      <w:r>
-        <w:rPr>
-          <w:sz w:val="28"/>
-          <w:szCs w:val="28"/>
-          <w:lang w:val="nl-NL"/>
-        </w:rPr>
-        <w:t>SimCenMar</w:t>
-      </w:r>
-      <w:proofErr w:type="spellEnd"/>
-      <w:r>
-        <w:rPr>
-          <w:sz w:val="28"/>
-          <w:szCs w:val="28"/>
-          <w:lang w:val="nl-NL"/>
-        </w:rPr>
-        <w:t xml:space="preserve">, </w:t>
-      </w:r>
-      <w:proofErr w:type="spellStart"/>
-      <w:r>
-        <w:rPr>
-          <w:sz w:val="28"/>
-          <w:szCs w:val="28"/>
-          <w:lang w:val="nl-NL"/>
-        </w:rPr>
-        <w:t>XRLabs</w:t>
-      </w:r>
-      <w:proofErr w:type="spellEnd"/>
-      <w:r>
-        <w:rPr>
-          <w:sz w:val="28"/>
-          <w:szCs w:val="28"/>
-          <w:lang w:val="nl-NL"/>
-        </w:rPr>
-        <w:t xml:space="preserve"> en Parallel. Ook heb ik vandaag met Hofland gezeten om te bespreken over de PAP aangezien hij het enorm druk had vrijdag.</w:t>
+        <w:t>Vandaag heb ik gesolliciteerd voor stage bij SimCenMar, XRLabs en Parallel. Ook heb ik vandaag met Hofland gezeten om te bespreken over de PAP aangezien hij het enorm druk had vrijdag.</w:t>
       </w:r>
     </w:p>
     <w:p>
@@ -1826,6 +1546,136 @@
           <w:lang w:val="nl-NL"/>
         </w:rPr>
         <w:t>Vandaag heb ik enorm veel progressie gemaakt tot de art in de biologie minigame en heb ik een mail gestuurd naar de stage bij de landmacht.</w:t>
+      </w:r>
+    </w:p>
+    <w:p>
+      <w:pPr>
+        <w:rPr>
+          <w:sz w:val="28"/>
+          <w:szCs w:val="28"/>
+          <w:lang w:val="nl-NL"/>
+        </w:rPr>
+      </w:pPr>
+    </w:p>
+    <w:p>
+      <w:pPr>
+        <w:rPr>
+          <w:sz w:val="28"/>
+          <w:szCs w:val="28"/>
+          <w:lang w:val="nl-NL"/>
+        </w:rPr>
+      </w:pPr>
+      <w:r>
+        <w:rPr>
+          <w:b/>
+          <w:bCs/>
+          <w:sz w:val="36"/>
+          <w:szCs w:val="36"/>
+          <w:lang w:val="nl-NL"/>
+        </w:rPr>
+        <w:t>Donder</w:t>
+      </w:r>
+      <w:r>
+        <w:rPr>
+          <w:b/>
+          <w:bCs/>
+          <w:sz w:val="36"/>
+          <w:szCs w:val="36"/>
+          <w:lang w:val="nl-NL"/>
+        </w:rPr>
+        <w:t xml:space="preserve">dag </w:t>
+      </w:r>
+      <w:r>
+        <w:rPr>
+          <w:b/>
+          <w:bCs/>
+          <w:sz w:val="36"/>
+          <w:szCs w:val="36"/>
+          <w:lang w:val="nl-NL"/>
+        </w:rPr>
+        <w:t>2</w:t>
+      </w:r>
+      <w:r>
+        <w:rPr>
+          <w:b/>
+          <w:bCs/>
+          <w:sz w:val="36"/>
+          <w:szCs w:val="36"/>
+          <w:lang w:val="nl-NL"/>
+        </w:rPr>
+        <w:t xml:space="preserve"> April</w:t>
+      </w:r>
+    </w:p>
+    <w:p>
+      <w:pPr>
+        <w:rPr>
+          <w:sz w:val="28"/>
+          <w:szCs w:val="28"/>
+          <w:lang w:val="nl-NL"/>
+        </w:rPr>
+      </w:pPr>
+      <w:r>
+        <w:rPr>
+          <w:sz w:val="28"/>
+          <w:szCs w:val="28"/>
+          <w:lang w:val="nl-NL"/>
+        </w:rPr>
+        <w:t>Vandaag heb ik thuisgewerkt aan de gameart.</w:t>
+      </w:r>
+    </w:p>
+    <w:p>
+      <w:pPr>
+        <w:rPr>
+          <w:sz w:val="28"/>
+          <w:szCs w:val="28"/>
+          <w:lang w:val="nl-NL"/>
+        </w:rPr>
+      </w:pPr>
+    </w:p>
+    <w:p>
+      <w:pPr>
+        <w:rPr>
+          <w:sz w:val="28"/>
+          <w:szCs w:val="28"/>
+          <w:lang w:val="nl-NL"/>
+        </w:rPr>
+      </w:pPr>
+      <w:r>
+        <w:rPr>
+          <w:b/>
+          <w:bCs/>
+          <w:sz w:val="36"/>
+          <w:szCs w:val="36"/>
+          <w:lang w:val="nl-NL"/>
+        </w:rPr>
+        <w:t>Vrij</w:t>
+      </w:r>
+      <w:r>
+        <w:rPr>
+          <w:b/>
+          <w:bCs/>
+          <w:sz w:val="36"/>
+          <w:szCs w:val="36"/>
+          <w:lang w:val="nl-NL"/>
+        </w:rPr>
+        <w:t>dag 2 April</w:t>
+      </w:r>
+    </w:p>
+    <w:p>
+      <w:pPr>
+        <w:rPr>
+          <w:sz w:val="28"/>
+          <w:szCs w:val="28"/>
+          <w:lang w:val="nl-NL"/>
+        </w:rPr>
+      </w:pPr>
+      <w:r>
+        <w:rPr>
+          <w:sz w:val="28"/>
+          <w:szCs w:val="28"/>
+          <w:lang w:val="nl-NL"/>
+        </w:rPr>
+        <w:t>Vandaag heb ik met Hofland gepraat over de PAP en ik heb aan de gameart gewerkt. Ook heb ik nu een deadline voor de lessen.</w:t>
       </w:r>
     </w:p>
     <w:p>

</xml_diff>

<commit_message>
main map toegevoegd voor de hub
</commit_message>
<xml_diff>
--- a/Documenten/Dagboek.docx
+++ b/Documenten/Dagboek.docx
@@ -79,7 +79,25 @@
           <w:szCs w:val="28"/>
           <w:lang w:val="nl-NL"/>
         </w:rPr>
-        <w:t>ag gehad ik kreeg een plekje in een kleine kamer die ze hadden. Verder hebben we besproken waar ik aan ga werken. Dat gaat een Serious game zijn voor hun arcadekast en daar gaan we ook mijn eerste leerdoel op laten richten aangezien ik meer Unreal engine wil leren en dat de perfecte kans is voor mij is.</w:t>
+        <w:t xml:space="preserve">ag gehad ik kreeg een plekje in een kleine kamer die ze hadden. Verder hebben we besproken waar ik aan ga werken. Dat gaat een </w:t>
+      </w:r>
+      <w:proofErr w:type="spellStart"/>
+      <w:r>
+        <w:rPr>
+          <w:sz w:val="28"/>
+          <w:szCs w:val="28"/>
+          <w:lang w:val="nl-NL"/>
+        </w:rPr>
+        <w:t>Serious</w:t>
+      </w:r>
+      <w:proofErr w:type="spellEnd"/>
+      <w:r>
+        <w:rPr>
+          <w:sz w:val="28"/>
+          <w:szCs w:val="28"/>
+          <w:lang w:val="nl-NL"/>
+        </w:rPr>
+        <w:t xml:space="preserve"> game zijn voor hun arcadekast en daar gaan we ook mijn eerste leerdoel op laten richten aangezien ik meer Unreal engine wil leren en dat de perfecte kans is voor mij is.</w:t>
       </w:r>
     </w:p>
     <w:p>
@@ -389,7 +407,25 @@
           <w:szCs w:val="28"/>
           <w:lang w:val="nl-NL"/>
         </w:rPr>
-        <w:t>Vandaag ben ik bezig geweest met bugfixes rond de UI omdat dat nog niet helemaal werkt. Net zoals elke andere Donderdag werk ik vandaag vanuit huis.</w:t>
+        <w:t xml:space="preserve">Vandaag ben ik bezig geweest met </w:t>
+      </w:r>
+      <w:proofErr w:type="spellStart"/>
+      <w:r>
+        <w:rPr>
+          <w:sz w:val="28"/>
+          <w:szCs w:val="28"/>
+          <w:lang w:val="nl-NL"/>
+        </w:rPr>
+        <w:t>bugfixes</w:t>
+      </w:r>
+      <w:proofErr w:type="spellEnd"/>
+      <w:r>
+        <w:rPr>
+          <w:sz w:val="28"/>
+          <w:szCs w:val="28"/>
+          <w:lang w:val="nl-NL"/>
+        </w:rPr>
+        <w:t xml:space="preserve"> rond de UI omdat dat nog niet helemaal werkt. Net zoals elke andere Donderdag werk ik vandaag vanuit huis.</w:t>
       </w:r>
     </w:p>
     <w:p>
@@ -434,7 +470,25 @@
           <w:szCs w:val="28"/>
           <w:lang w:val="nl-NL"/>
         </w:rPr>
-        <w:t>Vandaag heb ik nog meer bugfixes gedaan. Naast dat heb ik ook gezeten met meneer Hofland om te kijken hoe de week is gegaan. Daaruit kwam dat ik meer moet letten op mijn GitHub en Trello omdat ik deze week daar niet enorm op heb gelet.</w:t>
+        <w:t xml:space="preserve">Vandaag heb ik nog meer </w:t>
+      </w:r>
+      <w:proofErr w:type="spellStart"/>
+      <w:r>
+        <w:rPr>
+          <w:sz w:val="28"/>
+          <w:szCs w:val="28"/>
+          <w:lang w:val="nl-NL"/>
+        </w:rPr>
+        <w:t>bugfixes</w:t>
+      </w:r>
+      <w:proofErr w:type="spellEnd"/>
+      <w:r>
+        <w:rPr>
+          <w:sz w:val="28"/>
+          <w:szCs w:val="28"/>
+          <w:lang w:val="nl-NL"/>
+        </w:rPr>
+        <w:t xml:space="preserve"> gedaan. Naast dat heb ik ook gezeten met meneer Hofland om te kijken hoe de week is gegaan. Daaruit kwam dat ik meer moet letten op mijn GitHub en Trello omdat ik deze week daar niet enorm op heb gelet.</w:t>
       </w:r>
     </w:p>
     <w:p>
@@ -801,7 +855,25 @@
           <w:szCs w:val="28"/>
           <w:lang w:val="nl-NL"/>
         </w:rPr>
-        <w:t>Vandaag heb ik de geschiedenis minigame afgerond en 1 playtest gedaan met meneer Dukers omdat meneer koppelaar niet aanwezig was vandaag.</w:t>
+        <w:t xml:space="preserve">Vandaag heb ik de geschiedenis minigame afgerond en 1 </w:t>
+      </w:r>
+      <w:proofErr w:type="spellStart"/>
+      <w:r>
+        <w:rPr>
+          <w:sz w:val="28"/>
+          <w:szCs w:val="28"/>
+          <w:lang w:val="nl-NL"/>
+        </w:rPr>
+        <w:t>playtest</w:t>
+      </w:r>
+      <w:proofErr w:type="spellEnd"/>
+      <w:r>
+        <w:rPr>
+          <w:sz w:val="28"/>
+          <w:szCs w:val="28"/>
+          <w:lang w:val="nl-NL"/>
+        </w:rPr>
+        <w:t xml:space="preserve"> gedaan met meneer Dukers omdat meneer koppelaar niet aanwezig was vandaag.</w:t>
       </w:r>
     </w:p>
     <w:p>
@@ -846,7 +918,43 @@
           <w:szCs w:val="28"/>
           <w:lang w:val="nl-NL"/>
         </w:rPr>
-        <w:t>Vandaag ben ik op het idee gekomen voor de biologie minigame. Daaruit kwam dat het een game beetje zoals Overcooked gaat worden waar je cellen moet mixen en matchen om de correcte cel te krijgen. Ook heb ik de playtest met meneer koppelaar gedaan. Dat was allemaal heel succesvol gelukt.</w:t>
+        <w:t xml:space="preserve">Vandaag ben ik op het idee gekomen voor de biologie minigame. Daaruit kwam dat het een game beetje zoals </w:t>
+      </w:r>
+      <w:proofErr w:type="spellStart"/>
+      <w:r>
+        <w:rPr>
+          <w:sz w:val="28"/>
+          <w:szCs w:val="28"/>
+          <w:lang w:val="nl-NL"/>
+        </w:rPr>
+        <w:t>Overcooked</w:t>
+      </w:r>
+      <w:proofErr w:type="spellEnd"/>
+      <w:r>
+        <w:rPr>
+          <w:sz w:val="28"/>
+          <w:szCs w:val="28"/>
+          <w:lang w:val="nl-NL"/>
+        </w:rPr>
+        <w:t xml:space="preserve"> gaat worden waar je cellen moet mixen en matchen om de correcte cel te krijgen. Ook heb ik de </w:t>
+      </w:r>
+      <w:proofErr w:type="spellStart"/>
+      <w:r>
+        <w:rPr>
+          <w:sz w:val="28"/>
+          <w:szCs w:val="28"/>
+          <w:lang w:val="nl-NL"/>
+        </w:rPr>
+        <w:t>playtest</w:t>
+      </w:r>
+      <w:proofErr w:type="spellEnd"/>
+      <w:r>
+        <w:rPr>
+          <w:sz w:val="28"/>
+          <w:szCs w:val="28"/>
+          <w:lang w:val="nl-NL"/>
+        </w:rPr>
+        <w:t xml:space="preserve"> met meneer koppelaar gedaan. Dat was allemaal heel succesvol gelukt.</w:t>
       </w:r>
     </w:p>
     <w:p>
@@ -1026,7 +1134,43 @@
           <w:szCs w:val="28"/>
           <w:lang w:val="nl-NL"/>
         </w:rPr>
-        <w:t>Vandaag heb ik veel progressie gemaakt naar het prototype van de biologie minigame waaronder het hele gedoe van dingen oppakken en in je inventory stoppen ook heb ik een start gemaakt aan het gedoe van spullen op het crafting bureau gemaakt dus dat.</w:t>
+        <w:t xml:space="preserve">Vandaag heb ik veel progressie gemaakt naar het prototype van de biologie minigame waaronder het hele gedoe van dingen oppakken en in je </w:t>
+      </w:r>
+      <w:proofErr w:type="spellStart"/>
+      <w:r>
+        <w:rPr>
+          <w:sz w:val="28"/>
+          <w:szCs w:val="28"/>
+          <w:lang w:val="nl-NL"/>
+        </w:rPr>
+        <w:t>inventory</w:t>
+      </w:r>
+      <w:proofErr w:type="spellEnd"/>
+      <w:r>
+        <w:rPr>
+          <w:sz w:val="28"/>
+          <w:szCs w:val="28"/>
+          <w:lang w:val="nl-NL"/>
+        </w:rPr>
+        <w:t xml:space="preserve"> stoppen ook heb ik een start gemaakt aan het gedoe van spullen op het </w:t>
+      </w:r>
+      <w:proofErr w:type="spellStart"/>
+      <w:r>
+        <w:rPr>
+          <w:sz w:val="28"/>
+          <w:szCs w:val="28"/>
+          <w:lang w:val="nl-NL"/>
+        </w:rPr>
+        <w:t>crafting</w:t>
+      </w:r>
+      <w:proofErr w:type="spellEnd"/>
+      <w:r>
+        <w:rPr>
+          <w:sz w:val="28"/>
+          <w:szCs w:val="28"/>
+          <w:lang w:val="nl-NL"/>
+        </w:rPr>
+        <w:t xml:space="preserve"> bureau gemaakt dus dat.</w:t>
       </w:r>
       <w:r>
         <w:rPr>
@@ -1069,8 +1213,54 @@
           <w:szCs w:val="28"/>
           <w:lang w:val="nl-NL"/>
         </w:rPr>
-        <w:t>Vandaag heb ik veel progressie gemaakt richting de core mechanics van de biologie game waaronder het oppakken en neerzetten van objecten en het systeem van de crafting table</w:t>
-      </w:r>
+        <w:t xml:space="preserve">Vandaag heb ik veel progressie gemaakt richting de </w:t>
+      </w:r>
+      <w:proofErr w:type="spellStart"/>
+      <w:r>
+        <w:rPr>
+          <w:sz w:val="28"/>
+          <w:szCs w:val="28"/>
+          <w:lang w:val="nl-NL"/>
+        </w:rPr>
+        <w:t>core</w:t>
+      </w:r>
+      <w:proofErr w:type="spellEnd"/>
+      <w:r>
+        <w:rPr>
+          <w:sz w:val="28"/>
+          <w:szCs w:val="28"/>
+          <w:lang w:val="nl-NL"/>
+        </w:rPr>
+        <w:t xml:space="preserve"> mechanics van de biologie game waaronder het oppakken en neerzetten van objecten en het systeem van de </w:t>
+      </w:r>
+      <w:proofErr w:type="spellStart"/>
+      <w:r>
+        <w:rPr>
+          <w:sz w:val="28"/>
+          <w:szCs w:val="28"/>
+          <w:lang w:val="nl-NL"/>
+        </w:rPr>
+        <w:t>crafting</w:t>
+      </w:r>
+      <w:proofErr w:type="spellEnd"/>
+      <w:r>
+        <w:rPr>
+          <w:sz w:val="28"/>
+          <w:szCs w:val="28"/>
+          <w:lang w:val="nl-NL"/>
+        </w:rPr>
+        <w:t xml:space="preserve"> </w:t>
+      </w:r>
+      <w:proofErr w:type="spellStart"/>
+      <w:r>
+        <w:rPr>
+          <w:sz w:val="28"/>
+          <w:szCs w:val="28"/>
+          <w:lang w:val="nl-NL"/>
+        </w:rPr>
+        <w:t>table</w:t>
+      </w:r>
+      <w:proofErr w:type="spellEnd"/>
       <w:r>
         <w:rPr>
           <w:sz w:val="28"/>
@@ -1138,7 +1328,25 @@
           <w:szCs w:val="28"/>
           <w:lang w:val="nl-NL"/>
         </w:rPr>
-        <w:t xml:space="preserve">tijd zitten bug fixen rondom de crafting mechanic. Ook heb ik </w:t>
+        <w:t xml:space="preserve">tijd zitten bug fixen rondom de </w:t>
+      </w:r>
+      <w:proofErr w:type="spellStart"/>
+      <w:r>
+        <w:rPr>
+          <w:sz w:val="28"/>
+          <w:szCs w:val="28"/>
+          <w:lang w:val="nl-NL"/>
+        </w:rPr>
+        <w:t>crafting</w:t>
+      </w:r>
+      <w:proofErr w:type="spellEnd"/>
+      <w:r>
+        <w:rPr>
+          <w:sz w:val="28"/>
+          <w:szCs w:val="28"/>
+          <w:lang w:val="nl-NL"/>
+        </w:rPr>
+        <w:t xml:space="preserve"> mechanic. Ook heb ik </w:t>
       </w:r>
       <w:r>
         <w:rPr>
@@ -1298,7 +1506,43 @@
           <w:szCs w:val="28"/>
           <w:lang w:val="nl-NL"/>
         </w:rPr>
-        <w:t>Vandaag heb ik aan mijn portfolio gewerkt en de biologie pagine gebouwt.</w:t>
+        <w:t xml:space="preserve">Vandaag heb ik aan mijn portfolio gewerkt en de biologie </w:t>
+      </w:r>
+      <w:proofErr w:type="spellStart"/>
+      <w:r>
+        <w:rPr>
+          <w:sz w:val="28"/>
+          <w:szCs w:val="28"/>
+          <w:lang w:val="nl-NL"/>
+        </w:rPr>
+        <w:t>pagine</w:t>
+      </w:r>
+      <w:proofErr w:type="spellEnd"/>
+      <w:r>
+        <w:rPr>
+          <w:sz w:val="28"/>
+          <w:szCs w:val="28"/>
+          <w:lang w:val="nl-NL"/>
+        </w:rPr>
+        <w:t xml:space="preserve"> </w:t>
+      </w:r>
+      <w:proofErr w:type="spellStart"/>
+      <w:r>
+        <w:rPr>
+          <w:sz w:val="28"/>
+          <w:szCs w:val="28"/>
+          <w:lang w:val="nl-NL"/>
+        </w:rPr>
+        <w:t>gebouwt</w:t>
+      </w:r>
+      <w:proofErr w:type="spellEnd"/>
+      <w:r>
+        <w:rPr>
+          <w:sz w:val="28"/>
+          <w:szCs w:val="28"/>
+          <w:lang w:val="nl-NL"/>
+        </w:rPr>
+        <w:t>.</w:t>
       </w:r>
     </w:p>
     <w:p>
@@ -1389,7 +1633,386 @@
           <w:szCs w:val="28"/>
           <w:lang w:val="nl-NL"/>
         </w:rPr>
-        <w:t>Vandaag heb ik gesolliciteerd voor stage bij SimCenMar, XRLabs en Parallel. Ook heb ik vandaag met Hofland gezeten om te bespreken over de PAP aangezien hij het enorm druk had vrijdag.</w:t>
+        <w:t xml:space="preserve">Vandaag heb ik gesolliciteerd voor stage bij </w:t>
+      </w:r>
+      <w:proofErr w:type="spellStart"/>
+      <w:r>
+        <w:rPr>
+          <w:sz w:val="28"/>
+          <w:szCs w:val="28"/>
+          <w:lang w:val="nl-NL"/>
+        </w:rPr>
+        <w:t>SimCenMar</w:t>
+      </w:r>
+      <w:proofErr w:type="spellEnd"/>
+      <w:r>
+        <w:rPr>
+          <w:sz w:val="28"/>
+          <w:szCs w:val="28"/>
+          <w:lang w:val="nl-NL"/>
+        </w:rPr>
+        <w:t xml:space="preserve">, </w:t>
+      </w:r>
+      <w:proofErr w:type="spellStart"/>
+      <w:r>
+        <w:rPr>
+          <w:sz w:val="28"/>
+          <w:szCs w:val="28"/>
+          <w:lang w:val="nl-NL"/>
+        </w:rPr>
+        <w:t>XRLabs</w:t>
+      </w:r>
+      <w:proofErr w:type="spellEnd"/>
+      <w:r>
+        <w:rPr>
+          <w:sz w:val="28"/>
+          <w:szCs w:val="28"/>
+          <w:lang w:val="nl-NL"/>
+        </w:rPr>
+        <w:t xml:space="preserve"> en Parallel. Ook heb ik vandaag met Hofland gezeten om te bespreken over de PAP aangezien hij het enorm druk had vrijdag.</w:t>
+      </w:r>
+    </w:p>
+    <w:p>
+      <w:pPr>
+        <w:rPr>
+          <w:sz w:val="28"/>
+          <w:szCs w:val="28"/>
+          <w:lang w:val="nl-NL"/>
+        </w:rPr>
+      </w:pPr>
+    </w:p>
+    <w:p>
+      <w:pPr>
+        <w:rPr>
+          <w:sz w:val="28"/>
+          <w:szCs w:val="28"/>
+          <w:lang w:val="nl-NL"/>
+        </w:rPr>
+      </w:pPr>
+      <w:r>
+        <w:rPr>
+          <w:b/>
+          <w:bCs/>
+          <w:sz w:val="36"/>
+          <w:szCs w:val="36"/>
+          <w:lang w:val="nl-NL"/>
+        </w:rPr>
+        <w:t>Dinsdag 31 Maart</w:t>
+      </w:r>
+    </w:p>
+    <w:p>
+      <w:pPr>
+        <w:rPr>
+          <w:sz w:val="28"/>
+          <w:szCs w:val="28"/>
+          <w:lang w:val="nl-NL"/>
+        </w:rPr>
+      </w:pPr>
+      <w:r>
+        <w:rPr>
+          <w:sz w:val="28"/>
+          <w:szCs w:val="28"/>
+          <w:lang w:val="nl-NL"/>
+        </w:rPr>
+        <w:t xml:space="preserve">Vandaag heb ik mijn PAP </w:t>
+      </w:r>
+      <w:r>
+        <w:rPr>
+          <w:sz w:val="28"/>
+          <w:szCs w:val="28"/>
+          <w:lang w:val="nl-NL"/>
+        </w:rPr>
+        <w:t>geüpdatet</w:t>
+      </w:r>
+      <w:r>
+        <w:rPr>
+          <w:sz w:val="28"/>
+          <w:szCs w:val="28"/>
+          <w:lang w:val="nl-NL"/>
+        </w:rPr>
+        <w:t xml:space="preserve"> en ben ik begonnen aan de art voor de biologie minigame.</w:t>
+      </w:r>
+    </w:p>
+    <w:p>
+      <w:pPr>
+        <w:rPr>
+          <w:sz w:val="28"/>
+          <w:szCs w:val="28"/>
+          <w:lang w:val="nl-NL"/>
+        </w:rPr>
+      </w:pPr>
+    </w:p>
+    <w:p>
+      <w:pPr>
+        <w:rPr>
+          <w:sz w:val="28"/>
+          <w:szCs w:val="28"/>
+          <w:lang w:val="nl-NL"/>
+        </w:rPr>
+      </w:pPr>
+      <w:r>
+        <w:rPr>
+          <w:b/>
+          <w:bCs/>
+          <w:sz w:val="36"/>
+          <w:szCs w:val="36"/>
+          <w:lang w:val="nl-NL"/>
+        </w:rPr>
+        <w:t>Woensdag 1 April</w:t>
+      </w:r>
+    </w:p>
+    <w:p>
+      <w:pPr>
+        <w:rPr>
+          <w:sz w:val="28"/>
+          <w:szCs w:val="28"/>
+          <w:lang w:val="nl-NL"/>
+        </w:rPr>
+      </w:pPr>
+      <w:r>
+        <w:rPr>
+          <w:sz w:val="28"/>
+          <w:szCs w:val="28"/>
+          <w:lang w:val="nl-NL"/>
+        </w:rPr>
+        <w:t>Vandaag heb ik enorm veel progressie gemaakt tot de art in de biologie minigame en heb ik een mail gestuurd naar de stage bij de landmacht.</w:t>
+      </w:r>
+    </w:p>
+    <w:p>
+      <w:pPr>
+        <w:rPr>
+          <w:sz w:val="28"/>
+          <w:szCs w:val="28"/>
+          <w:lang w:val="nl-NL"/>
+        </w:rPr>
+      </w:pPr>
+    </w:p>
+    <w:p>
+      <w:pPr>
+        <w:rPr>
+          <w:sz w:val="28"/>
+          <w:szCs w:val="28"/>
+          <w:lang w:val="nl-NL"/>
+        </w:rPr>
+      </w:pPr>
+      <w:r>
+        <w:rPr>
+          <w:b/>
+          <w:bCs/>
+          <w:sz w:val="36"/>
+          <w:szCs w:val="36"/>
+          <w:lang w:val="nl-NL"/>
+        </w:rPr>
+        <w:t>Donderdag 2 April</w:t>
+      </w:r>
+    </w:p>
+    <w:p>
+      <w:pPr>
+        <w:rPr>
+          <w:sz w:val="28"/>
+          <w:szCs w:val="28"/>
+          <w:lang w:val="nl-NL"/>
+        </w:rPr>
+      </w:pPr>
+      <w:r>
+        <w:rPr>
+          <w:sz w:val="28"/>
+          <w:szCs w:val="28"/>
+          <w:lang w:val="nl-NL"/>
+        </w:rPr>
+        <w:t>Vandaag heb ik thuisgewerkt aan de gameart.</w:t>
+      </w:r>
+    </w:p>
+    <w:p>
+      <w:pPr>
+        <w:rPr>
+          <w:sz w:val="28"/>
+          <w:szCs w:val="28"/>
+          <w:lang w:val="nl-NL"/>
+        </w:rPr>
+      </w:pPr>
+    </w:p>
+    <w:p>
+      <w:pPr>
+        <w:rPr>
+          <w:sz w:val="28"/>
+          <w:szCs w:val="28"/>
+          <w:lang w:val="nl-NL"/>
+        </w:rPr>
+      </w:pPr>
+      <w:r>
+        <w:rPr>
+          <w:b/>
+          <w:bCs/>
+          <w:sz w:val="36"/>
+          <w:szCs w:val="36"/>
+          <w:lang w:val="nl-NL"/>
+        </w:rPr>
+        <w:t xml:space="preserve">Vrijdag </w:t>
+      </w:r>
+      <w:r>
+        <w:rPr>
+          <w:b/>
+          <w:bCs/>
+          <w:sz w:val="36"/>
+          <w:szCs w:val="36"/>
+          <w:lang w:val="nl-NL"/>
+        </w:rPr>
+        <w:t>3</w:t>
+      </w:r>
+      <w:r>
+        <w:rPr>
+          <w:b/>
+          <w:bCs/>
+          <w:sz w:val="36"/>
+          <w:szCs w:val="36"/>
+          <w:lang w:val="nl-NL"/>
+        </w:rPr>
+        <w:t xml:space="preserve"> April</w:t>
+      </w:r>
+    </w:p>
+    <w:p>
+      <w:pPr>
+        <w:rPr>
+          <w:b/>
+          <w:bCs/>
+          <w:sz w:val="36"/>
+          <w:szCs w:val="36"/>
+          <w:lang w:val="nl-NL"/>
+        </w:rPr>
+      </w:pPr>
+      <w:r>
+        <w:rPr>
+          <w:sz w:val="28"/>
+          <w:szCs w:val="28"/>
+          <w:lang w:val="nl-NL"/>
+        </w:rPr>
+        <w:t xml:space="preserve">Vandaag heb ik met Hofland gepraat over de PAP en ik heb aan de </w:t>
+      </w:r>
+      <w:proofErr w:type="spellStart"/>
+      <w:r>
+        <w:rPr>
+          <w:sz w:val="28"/>
+          <w:szCs w:val="28"/>
+          <w:lang w:val="nl-NL"/>
+        </w:rPr>
+        <w:t>gameart</w:t>
+      </w:r>
+      <w:proofErr w:type="spellEnd"/>
+      <w:r>
+        <w:rPr>
+          <w:sz w:val="28"/>
+          <w:szCs w:val="28"/>
+          <w:lang w:val="nl-NL"/>
+        </w:rPr>
+        <w:t xml:space="preserve"> gewerkt. Ook heb ik nu een deadline voor de lessen.</w:t>
+      </w:r>
+      <w:r>
+        <w:rPr>
+          <w:sz w:val="28"/>
+          <w:szCs w:val="28"/>
+          <w:lang w:val="nl-NL"/>
+        </w:rPr>
+        <w:br/>
+      </w:r>
+    </w:p>
+    <w:p>
+      <w:pPr>
+        <w:rPr>
+          <w:sz w:val="28"/>
+          <w:szCs w:val="28"/>
+          <w:lang w:val="nl-NL"/>
+        </w:rPr>
+      </w:pPr>
+      <w:r>
+        <w:rPr>
+          <w:b/>
+          <w:bCs/>
+          <w:sz w:val="36"/>
+          <w:szCs w:val="36"/>
+          <w:lang w:val="nl-NL"/>
+        </w:rPr>
+        <w:lastRenderedPageBreak/>
+        <w:t>Maandag 5 April tot en met 17 Mei</w:t>
+      </w:r>
+    </w:p>
+    <w:p>
+      <w:pPr>
+        <w:rPr>
+          <w:sz w:val="28"/>
+          <w:szCs w:val="28"/>
+          <w:lang w:val="nl-NL"/>
+        </w:rPr>
+      </w:pPr>
+      <w:r>
+        <w:rPr>
+          <w:sz w:val="28"/>
+          <w:szCs w:val="28"/>
+          <w:lang w:val="nl-NL"/>
+        </w:rPr>
+        <w:t xml:space="preserve">Ik had in deze tijdperiode geen toegang tot </w:t>
+      </w:r>
+      <w:proofErr w:type="gramStart"/>
+      <w:r>
+        <w:rPr>
+          <w:sz w:val="28"/>
+          <w:szCs w:val="28"/>
+          <w:lang w:val="nl-NL"/>
+        </w:rPr>
+        <w:t>word</w:t>
+      </w:r>
+      <w:proofErr w:type="gramEnd"/>
+      <w:r>
+        <w:rPr>
+          <w:sz w:val="28"/>
+          <w:szCs w:val="28"/>
+          <w:lang w:val="nl-NL"/>
+        </w:rPr>
+        <w:t xml:space="preserve"> i.v.m. technische problemen. Maar ik heb de biologie minigame afgerond op vrijdag 15 Mei.</w:t>
+      </w:r>
+      <w:r>
+        <w:rPr>
+          <w:sz w:val="28"/>
+          <w:szCs w:val="28"/>
+          <w:lang w:val="nl-NL"/>
+        </w:rPr>
+        <w:br/>
+      </w:r>
+    </w:p>
+    <w:p>
+      <w:pPr>
+        <w:rPr>
+          <w:sz w:val="28"/>
+          <w:szCs w:val="28"/>
+          <w:lang w:val="nl-NL"/>
+        </w:rPr>
+      </w:pPr>
+      <w:r>
+        <w:rPr>
+          <w:b/>
+          <w:bCs/>
+          <w:sz w:val="36"/>
+          <w:szCs w:val="36"/>
+          <w:lang w:val="nl-NL"/>
+        </w:rPr>
+        <w:t>Maandag 18 Mei</w:t>
+      </w:r>
+    </w:p>
+    <w:p>
+      <w:pPr>
+        <w:rPr>
+          <w:sz w:val="28"/>
+          <w:szCs w:val="28"/>
+          <w:lang w:val="nl-NL"/>
+        </w:rPr>
+      </w:pPr>
+      <w:r>
+        <w:rPr>
+          <w:sz w:val="28"/>
+          <w:szCs w:val="28"/>
+          <w:lang w:val="nl-NL"/>
+        </w:rPr>
+        <w:t>Vandaag heb ik aan de centrale hub gewerkt. Ik heb daarin het gebied van blauw geel en rood grotendeels gedaan.</w:t>
       </w:r>
     </w:p>
     <w:p>
@@ -1427,255 +2050,135 @@
           <w:szCs w:val="36"/>
           <w:lang w:val="nl-NL"/>
         </w:rPr>
-        <w:t>dag 3</w:t>
-      </w:r>
-      <w:r>
-        <w:rPr>
-          <w:b/>
-          <w:bCs/>
-          <w:sz w:val="36"/>
-          <w:szCs w:val="36"/>
-          <w:lang w:val="nl-NL"/>
-        </w:rPr>
-        <w:t>1</w:t>
-      </w:r>
-      <w:r>
-        <w:rPr>
-          <w:b/>
-          <w:bCs/>
-          <w:sz w:val="36"/>
-          <w:szCs w:val="36"/>
-          <w:lang w:val="nl-NL"/>
-        </w:rPr>
-        <w:t xml:space="preserve"> Maart</w:t>
-      </w:r>
-    </w:p>
-    <w:p>
-      <w:pPr>
-        <w:rPr>
-          <w:sz w:val="28"/>
-          <w:szCs w:val="28"/>
-          <w:lang w:val="nl-NL"/>
-        </w:rPr>
-      </w:pPr>
-      <w:r>
-        <w:rPr>
-          <w:sz w:val="28"/>
-          <w:szCs w:val="28"/>
-          <w:lang w:val="nl-NL"/>
-        </w:rPr>
-        <w:t xml:space="preserve">Vandaag heb ik mijn PAP </w:t>
-      </w:r>
-      <w:r>
-        <w:rPr>
-          <w:sz w:val="28"/>
-          <w:szCs w:val="28"/>
-          <w:lang w:val="nl-NL"/>
-        </w:rPr>
-        <w:t>geüpdatet</w:t>
-      </w:r>
-      <w:r>
-        <w:rPr>
-          <w:sz w:val="28"/>
-          <w:szCs w:val="28"/>
-          <w:lang w:val="nl-NL"/>
-        </w:rPr>
-        <w:t xml:space="preserve"> en ben ik begonnen aan de art voor de biologie minigame.</w:t>
-      </w:r>
-    </w:p>
-    <w:p>
-      <w:pPr>
-        <w:rPr>
-          <w:sz w:val="28"/>
-          <w:szCs w:val="28"/>
-          <w:lang w:val="nl-NL"/>
-        </w:rPr>
-      </w:pPr>
-    </w:p>
-    <w:p>
-      <w:pPr>
-        <w:rPr>
-          <w:sz w:val="28"/>
-          <w:szCs w:val="28"/>
-          <w:lang w:val="nl-NL"/>
-        </w:rPr>
-      </w:pPr>
-      <w:r>
-        <w:rPr>
-          <w:b/>
-          <w:bCs/>
-          <w:sz w:val="36"/>
-          <w:szCs w:val="36"/>
-          <w:lang w:val="nl-NL"/>
-        </w:rPr>
-        <w:t>Woens</w:t>
-      </w:r>
-      <w:r>
-        <w:rPr>
-          <w:b/>
-          <w:bCs/>
-          <w:sz w:val="36"/>
-          <w:szCs w:val="36"/>
-          <w:lang w:val="nl-NL"/>
-        </w:rPr>
-        <w:t xml:space="preserve">dag </w:t>
-      </w:r>
-      <w:r>
-        <w:rPr>
-          <w:b/>
-          <w:bCs/>
-          <w:sz w:val="36"/>
-          <w:szCs w:val="36"/>
-          <w:lang w:val="nl-NL"/>
-        </w:rPr>
-        <w:t>1 April</w:t>
-      </w:r>
-    </w:p>
-    <w:p>
-      <w:pPr>
-        <w:rPr>
-          <w:sz w:val="28"/>
-          <w:szCs w:val="28"/>
-          <w:lang w:val="nl-NL"/>
-        </w:rPr>
-      </w:pPr>
-      <w:r>
-        <w:rPr>
-          <w:sz w:val="28"/>
-          <w:szCs w:val="28"/>
-          <w:lang w:val="nl-NL"/>
-        </w:rPr>
-        <w:t>Vandaag heb ik enorm veel progressie gemaakt tot de art in de biologie minigame en heb ik een mail gestuurd naar de stage bij de landmacht.</w:t>
-      </w:r>
-    </w:p>
-    <w:p>
-      <w:pPr>
-        <w:rPr>
-          <w:sz w:val="28"/>
-          <w:szCs w:val="28"/>
-          <w:lang w:val="nl-NL"/>
-        </w:rPr>
-      </w:pPr>
-    </w:p>
-    <w:p>
-      <w:pPr>
-        <w:rPr>
-          <w:sz w:val="28"/>
-          <w:szCs w:val="28"/>
-          <w:lang w:val="nl-NL"/>
-        </w:rPr>
-      </w:pPr>
-      <w:r>
-        <w:rPr>
-          <w:b/>
-          <w:bCs/>
-          <w:sz w:val="36"/>
-          <w:szCs w:val="36"/>
-          <w:lang w:val="nl-NL"/>
-        </w:rPr>
-        <w:t>Donder</w:t>
-      </w:r>
-      <w:r>
-        <w:rPr>
-          <w:b/>
-          <w:bCs/>
-          <w:sz w:val="36"/>
-          <w:szCs w:val="36"/>
-          <w:lang w:val="nl-NL"/>
-        </w:rPr>
-        <w:t xml:space="preserve">dag </w:t>
-      </w:r>
-      <w:r>
-        <w:rPr>
-          <w:b/>
-          <w:bCs/>
-          <w:sz w:val="36"/>
-          <w:szCs w:val="36"/>
-          <w:lang w:val="nl-NL"/>
-        </w:rPr>
-        <w:t>2</w:t>
-      </w:r>
-      <w:r>
-        <w:rPr>
-          <w:b/>
-          <w:bCs/>
-          <w:sz w:val="36"/>
-          <w:szCs w:val="36"/>
-          <w:lang w:val="nl-NL"/>
-        </w:rPr>
-        <w:t xml:space="preserve"> April</w:t>
-      </w:r>
-    </w:p>
-    <w:p>
-      <w:pPr>
-        <w:rPr>
-          <w:sz w:val="28"/>
-          <w:szCs w:val="28"/>
-          <w:lang w:val="nl-NL"/>
-        </w:rPr>
-      </w:pPr>
-      <w:r>
-        <w:rPr>
-          <w:sz w:val="28"/>
-          <w:szCs w:val="28"/>
-          <w:lang w:val="nl-NL"/>
-        </w:rPr>
-        <w:t>Vandaag heb ik thuisgewerkt aan de gameart.</w:t>
-      </w:r>
-    </w:p>
-    <w:p>
-      <w:pPr>
-        <w:rPr>
-          <w:sz w:val="28"/>
-          <w:szCs w:val="28"/>
-          <w:lang w:val="nl-NL"/>
-        </w:rPr>
-      </w:pPr>
-    </w:p>
-    <w:p>
-      <w:pPr>
-        <w:rPr>
-          <w:sz w:val="28"/>
-          <w:szCs w:val="28"/>
-          <w:lang w:val="nl-NL"/>
-        </w:rPr>
-      </w:pPr>
-      <w:r>
-        <w:rPr>
-          <w:b/>
-          <w:bCs/>
-          <w:sz w:val="36"/>
-          <w:szCs w:val="36"/>
-          <w:lang w:val="nl-NL"/>
-        </w:rPr>
-        <w:t>Vrij</w:t>
-      </w:r>
-      <w:r>
-        <w:rPr>
-          <w:b/>
-          <w:bCs/>
-          <w:sz w:val="36"/>
-          <w:szCs w:val="36"/>
-          <w:lang w:val="nl-NL"/>
-        </w:rPr>
-        <w:t>dag 2 April</w:t>
-      </w:r>
-    </w:p>
-    <w:p>
-      <w:pPr>
-        <w:rPr>
-          <w:sz w:val="28"/>
-          <w:szCs w:val="28"/>
-          <w:lang w:val="nl-NL"/>
-        </w:rPr>
-      </w:pPr>
-      <w:r>
-        <w:rPr>
-          <w:sz w:val="28"/>
-          <w:szCs w:val="28"/>
-          <w:lang w:val="nl-NL"/>
-        </w:rPr>
-        <w:t>Vandaag heb ik met Hofland gepraat over de PAP en ik heb aan de gameart gewerkt. Ook heb ik nu een deadline voor de lessen.</w:t>
+        <w:t>dag 1</w:t>
+      </w:r>
+      <w:r>
+        <w:rPr>
+          <w:b/>
+          <w:bCs/>
+          <w:sz w:val="36"/>
+          <w:szCs w:val="36"/>
+          <w:lang w:val="nl-NL"/>
+        </w:rPr>
+        <w:t>9</w:t>
+      </w:r>
+      <w:r>
+        <w:rPr>
+          <w:b/>
+          <w:bCs/>
+          <w:sz w:val="36"/>
+          <w:szCs w:val="36"/>
+          <w:lang w:val="nl-NL"/>
+        </w:rPr>
+        <w:t xml:space="preserve"> Mei</w:t>
+      </w:r>
+    </w:p>
+    <w:p>
+      <w:pPr>
+        <w:rPr>
+          <w:sz w:val="28"/>
+          <w:szCs w:val="28"/>
+          <w:lang w:val="nl-NL"/>
+        </w:rPr>
+      </w:pPr>
+      <w:r>
+        <w:rPr>
+          <w:sz w:val="28"/>
+          <w:szCs w:val="28"/>
+          <w:lang w:val="nl-NL"/>
+        </w:rPr>
+        <w:t xml:space="preserve">Vandaag heb ik een groot deel van de binnenkant van de map </w:t>
+      </w:r>
+      <w:proofErr w:type="spellStart"/>
+      <w:r>
+        <w:rPr>
+          <w:sz w:val="28"/>
+          <w:szCs w:val="28"/>
+          <w:lang w:val="nl-NL"/>
+        </w:rPr>
+        <w:t>gedesigned</w:t>
+      </w:r>
+      <w:proofErr w:type="spellEnd"/>
+      <w:r>
+        <w:rPr>
+          <w:sz w:val="28"/>
+          <w:szCs w:val="28"/>
+          <w:lang w:val="nl-NL"/>
+        </w:rPr>
+        <w:t xml:space="preserve"> en heb ik </w:t>
+      </w:r>
+      <w:proofErr w:type="spellStart"/>
+      <w:r>
+        <w:rPr>
+          <w:sz w:val="28"/>
+          <w:szCs w:val="28"/>
+          <w:lang w:val="nl-NL"/>
+        </w:rPr>
+        <w:t>ik</w:t>
+      </w:r>
+      <w:proofErr w:type="spellEnd"/>
+      <w:r>
+        <w:rPr>
+          <w:sz w:val="28"/>
+          <w:szCs w:val="28"/>
+          <w:lang w:val="nl-NL"/>
+        </w:rPr>
+        <w:t xml:space="preserve"> dingen zoals een plafond en lichten toegevoegd. Nu begint het echt te voelen als de school zelf</w:t>
+      </w:r>
+    </w:p>
+    <w:p>
+      <w:pPr>
+        <w:rPr>
+          <w:sz w:val="28"/>
+          <w:szCs w:val="28"/>
+          <w:lang w:val="nl-NL"/>
+        </w:rPr>
+      </w:pPr>
+    </w:p>
+    <w:p>
+      <w:pPr>
+        <w:rPr>
+          <w:sz w:val="28"/>
+          <w:szCs w:val="28"/>
+          <w:lang w:val="nl-NL"/>
+        </w:rPr>
+      </w:pPr>
+      <w:r>
+        <w:rPr>
+          <w:b/>
+          <w:bCs/>
+          <w:sz w:val="36"/>
+          <w:szCs w:val="36"/>
+          <w:lang w:val="nl-NL"/>
+        </w:rPr>
+        <w:t>Woensdag 20</w:t>
+      </w:r>
+      <w:r>
+        <w:rPr>
+          <w:b/>
+          <w:bCs/>
+          <w:sz w:val="36"/>
+          <w:szCs w:val="36"/>
+          <w:lang w:val="nl-NL"/>
+        </w:rPr>
+        <w:t xml:space="preserve"> Mei</w:t>
+      </w:r>
+    </w:p>
+    <w:p>
+      <w:pPr>
+        <w:rPr>
+          <w:sz w:val="28"/>
+          <w:szCs w:val="28"/>
+          <w:lang w:val="nl-NL"/>
+        </w:rPr>
+      </w:pPr>
+      <w:r>
+        <w:rPr>
+          <w:sz w:val="28"/>
+          <w:szCs w:val="28"/>
+          <w:lang w:val="nl-NL"/>
+        </w:rPr>
+        <w:t>Vandaag heb ik gewerkt aan het maken van de lesjes en heb ik mijn eerste les gegeven aan de kinderen. Deze les ging enorm goed en zowel ik als meneer Hofland zijn er erg tevreden over.</w:t>
       </w:r>
     </w:p>
     <w:p>

</xml_diff>